<commit_message>
Fixed deployment, ingress and configmap. Tried with creating docker images from pipeline
</commit_message>
<xml_diff>
--- a/documentation/DujmovAndela-diplomski.docx
+++ b/documentation/DujmovAndela-diplomski.docx
@@ -548,39 +548,7 @@
           <w:sz w:val="28"/>
           <w:szCs w:val="28"/>
         </w:rPr>
-        <w:t xml:space="preserve">Split, </w:t>
-      </w:r>
-      <w:r>
-        <w:rPr>
-          <w:rFonts w:cs="Times New Roman"/>
-          <w:sz w:val="28"/>
-          <w:szCs w:val="28"/>
-        </w:rPr>
-        <w:t>lipanj</w:t>
-      </w:r>
-      <w:r>
-        <w:rPr>
-          <w:rFonts w:cs="Times New Roman"/>
-          <w:sz w:val="28"/>
-          <w:szCs w:val="28"/>
-        </w:rPr>
-        <w:t xml:space="preserve"> </w:t>
-      </w:r>
-      <w:r>
-        <w:rPr>
-          <w:rFonts w:cs="Times New Roman"/>
-          <w:sz w:val="28"/>
-          <w:szCs w:val="28"/>
-        </w:rPr>
-        <w:t>2026</w:t>
-      </w:r>
-      <w:r>
-        <w:rPr>
-          <w:rFonts w:cs="Times New Roman"/>
-          <w:sz w:val="28"/>
-          <w:szCs w:val="28"/>
-        </w:rPr>
-        <w:t>.</w:t>
+        <w:t>Split, lipanj 2026.</w:t>
       </w:r>
       <w:r>
         <w:rPr/>
@@ -790,16 +758,7 @@
           <w:sz w:val="32"/>
           <w:szCs w:val="32"/>
         </w:rPr>
-        <w:t>Na</w:t>
-      </w:r>
-      <w:r>
-        <w:rPr>
-          <w:rFonts w:cs="Times New Roman"/>
-          <w:color w:val="000000" w:themeColor="text1"/>
-          <w:sz w:val="32"/>
-          <w:szCs w:val="32"/>
-        </w:rPr>
-        <w:t>predno prospajanje u računalnim mrežama</w:t>
+        <w:t>Napredno prospajanje u računalnim mrežama</w:t>
       </w:r>
     </w:p>
     <w:p>
@@ -985,14 +944,6 @@
           <w:szCs w:val="28"/>
         </w:rPr>
         <w:tab/>
-      </w:r>
-      <w:r>
-        <w:rPr>
-          <w:rFonts w:cs="Times New Roman"/>
-          <w:color w:val="000000" w:themeColor="text1"/>
-          <w:sz w:val="28"/>
-          <w:szCs w:val="28"/>
-        </w:rPr>
         <w:t>Anđela Dujmov</w:t>
       </w:r>
     </w:p>
@@ -1294,39 +1245,7 @@
           <w:sz w:val="28"/>
           <w:szCs w:val="28"/>
         </w:rPr>
-        <w:t xml:space="preserve">Split, </w:t>
-      </w:r>
-      <w:r>
-        <w:rPr>
-          <w:rFonts w:cs="Times New Roman"/>
-          <w:sz w:val="28"/>
-          <w:szCs w:val="28"/>
-        </w:rPr>
-        <w:t>lipanj</w:t>
-      </w:r>
-      <w:r>
-        <w:rPr>
-          <w:rFonts w:cs="Times New Roman"/>
-          <w:sz w:val="28"/>
-          <w:szCs w:val="28"/>
-        </w:rPr>
-        <w:t xml:space="preserve"> </w:t>
-      </w:r>
-      <w:r>
-        <w:rPr>
-          <w:rFonts w:cs="Times New Roman"/>
-          <w:sz w:val="28"/>
-          <w:szCs w:val="28"/>
-        </w:rPr>
-        <w:t>2026</w:t>
-      </w:r>
-      <w:r>
-        <w:rPr>
-          <w:rFonts w:cs="Times New Roman"/>
-          <w:sz w:val="28"/>
-          <w:szCs w:val="28"/>
-        </w:rPr>
-        <w:t>.</w:t>
+        <w:t>Split, lipanj 2026.</w:t>
       </w:r>
     </w:p>
     <w:p>
@@ -1380,6 +1299,7 @@
             <w:rPr>
               <w:webHidden/>
               <w:rStyle w:val="IndexLink"/>
+              <w:vanish w:val="false"/>
             </w:rPr>
             <w:instrText> TOC \z \o "1-3" \u \h</w:instrText>
           </w:r>
@@ -1387,6 +1307,7 @@
             <w:rPr>
               <w:webHidden/>
               <w:rStyle w:val="IndexLink"/>
+              <w:vanish w:val="false"/>
             </w:rPr>
             <w:fldChar w:fldCharType="separate"/>
           </w:r>
@@ -1394,13 +1315,6 @@
             <w:r>
               <w:rPr>
                 <w:webHidden/>
-                <w:rStyle w:val="IndexLink"/>
-              </w:rPr>
-              <w:t>Sažetak</w:t>
-            </w:r>
-            <w:r>
-              <w:rPr>
-                <w:webHidden/>
               </w:rPr>
               <w:fldChar w:fldCharType="begin"/>
             </w:r>
@@ -1418,9 +1332,11 @@
             </w:r>
             <w:r>
               <w:rPr>
+                <w:webHidden/>
                 <w:rStyle w:val="IndexLink"/>
                 <w:vanish w:val="false"/>
               </w:rPr>
+              <w:t>Sažetak</w:t>
               <w:tab/>
               <w:t>1</w:t>
             </w:r>
@@ -1449,6 +1365,7 @@
               <w:rPr>
                 <w:webHidden/>
                 <w:rStyle w:val="IndexLink"/>
+                <w:vanish w:val="false"/>
               </w:rPr>
               <w:t>1.</w:t>
             </w:r>
@@ -1520,6 +1437,7 @@
               <w:rPr>
                 <w:webHidden/>
                 <w:rStyle w:val="IndexLink"/>
+                <w:vanish w:val="false"/>
               </w:rPr>
               <w:t>2.</w:t>
             </w:r>
@@ -1593,6 +1511,7 @@
               <w:rPr>
                 <w:webHidden/>
                 <w:rStyle w:val="IndexLink"/>
+                <w:vanish w:val="false"/>
               </w:rPr>
               <w:t>2.1.</w:t>
             </w:r>
@@ -1666,6 +1585,7 @@
               <w:rPr>
                 <w:webHidden/>
                 <w:rStyle w:val="IndexLink"/>
+                <w:vanish w:val="false"/>
               </w:rPr>
               <w:t>2.1.1.</w:t>
             </w:r>
@@ -1740,6 +1660,7 @@
               <w:rPr>
                 <w:webHidden/>
                 <w:rStyle w:val="IndexLink"/>
+                <w:vanish w:val="false"/>
               </w:rPr>
               <w:t>2.1.2.</w:t>
             </w:r>
@@ -1813,6 +1734,7 @@
               <w:rPr>
                 <w:webHidden/>
                 <w:rStyle w:val="IndexLink"/>
+                <w:vanish w:val="false"/>
               </w:rPr>
               <w:t>2.2.</w:t>
             </w:r>
@@ -1885,6 +1807,7 @@
               <w:rPr>
                 <w:webHidden/>
                 <w:rStyle w:val="IndexLink"/>
+                <w:vanish w:val="false"/>
               </w:rPr>
               <w:t>2.3.</w:t>
             </w:r>
@@ -1955,6 +1878,7 @@
               <w:rPr>
                 <w:webHidden/>
                 <w:rStyle w:val="IndexLink"/>
+                <w:vanish w:val="false"/>
               </w:rPr>
               <w:t>3.</w:t>
             </w:r>
@@ -2028,6 +1952,7 @@
               <w:rPr>
                 <w:webHidden/>
                 <w:rStyle w:val="IndexLink"/>
+                <w:vanish w:val="false"/>
               </w:rPr>
               <w:t>3.1.</w:t>
             </w:r>
@@ -2100,6 +2025,7 @@
               <w:rPr>
                 <w:webHidden/>
                 <w:rStyle w:val="IndexLink"/>
+                <w:vanish w:val="false"/>
               </w:rPr>
               <w:t>3.2.</w:t>
             </w:r>
@@ -2173,6 +2099,7 @@
               <w:rPr>
                 <w:webHidden/>
                 <w:rStyle w:val="IndexLink"/>
+                <w:vanish w:val="false"/>
               </w:rPr>
               <w:t>3.2.1.</w:t>
             </w:r>
@@ -2247,6 +2174,7 @@
               <w:rPr>
                 <w:webHidden/>
                 <w:rStyle w:val="IndexLink"/>
+                <w:vanish w:val="false"/>
               </w:rPr>
               <w:t>3.2.2.</w:t>
             </w:r>
@@ -2320,6 +2248,7 @@
               <w:rPr>
                 <w:webHidden/>
                 <w:rStyle w:val="IndexLink"/>
+                <w:vanish w:val="false"/>
               </w:rPr>
               <w:t>3.3.</w:t>
             </w:r>
@@ -2392,6 +2321,7 @@
               <w:rPr>
                 <w:webHidden/>
                 <w:rStyle w:val="IndexLink"/>
+                <w:vanish w:val="false"/>
               </w:rPr>
               <w:t>3.4.</w:t>
             </w:r>
@@ -2464,6 +2394,7 @@
               <w:rPr>
                 <w:webHidden/>
                 <w:rStyle w:val="IndexLink"/>
+                <w:vanish w:val="false"/>
               </w:rPr>
               <w:t>3.5.</w:t>
             </w:r>
@@ -2534,6 +2465,7 @@
               <w:rPr>
                 <w:webHidden/>
                 <w:rStyle w:val="IndexLink"/>
+                <w:vanish w:val="false"/>
               </w:rPr>
               <w:t>4.</w:t>
             </w:r>
@@ -2607,6 +2539,7 @@
               <w:rPr>
                 <w:webHidden/>
                 <w:rStyle w:val="IndexLink"/>
+                <w:vanish w:val="false"/>
               </w:rPr>
               <w:t>4.1.</w:t>
             </w:r>
@@ -2679,6 +2612,7 @@
               <w:rPr>
                 <w:webHidden/>
                 <w:rStyle w:val="IndexLink"/>
+                <w:vanish w:val="false"/>
               </w:rPr>
               <w:t>4.2.</w:t>
             </w:r>
@@ -2751,6 +2685,7 @@
               <w:rPr>
                 <w:webHidden/>
                 <w:rStyle w:val="IndexLink"/>
+                <w:vanish w:val="false"/>
               </w:rPr>
               <w:t>4.3.</w:t>
             </w:r>
@@ -2821,6 +2756,7 @@
               <w:rPr>
                 <w:webHidden/>
                 <w:rStyle w:val="IndexLink"/>
+                <w:vanish w:val="false"/>
               </w:rPr>
               <w:t>5.</w:t>
             </w:r>
@@ -2891,13 +2827,6 @@
             <w:r>
               <w:rPr>
                 <w:webHidden/>
-                <w:rStyle w:val="IndexLink"/>
-              </w:rPr>
-              <w:t>Literatura</w:t>
-            </w:r>
-            <w:r>
-              <w:rPr>
-                <w:webHidden/>
               </w:rPr>
               <w:fldChar w:fldCharType="begin"/>
             </w:r>
@@ -2915,9 +2844,11 @@
             </w:r>
             <w:r>
               <w:rPr>
+                <w:webHidden/>
                 <w:rStyle w:val="IndexLink"/>
                 <w:vanish w:val="false"/>
               </w:rPr>
+              <w:t>Literatura</w:t>
               <w:tab/>
               <w:t>15</w:t>
             </w:r>
@@ -2945,13 +2876,6 @@
             <w:r>
               <w:rPr>
                 <w:webHidden/>
-                <w:rStyle w:val="IndexLink"/>
-              </w:rPr>
-              <w:t>Dodatak</w:t>
-            </w:r>
-            <w:r>
-              <w:rPr>
-                <w:webHidden/>
               </w:rPr>
               <w:fldChar w:fldCharType="begin"/>
             </w:r>
@@ -2969,9 +2893,11 @@
             </w:r>
             <w:r>
               <w:rPr>
+                <w:webHidden/>
                 <w:rStyle w:val="IndexLink"/>
                 <w:vanish w:val="false"/>
               </w:rPr>
+              <w:t>Dodatak</w:t>
               <w:tab/>
               <w:t>16</w:t>
             </w:r>
@@ -3189,7 +3115,9 @@
         </w:rPr>
       </w:pPr>
       <w:r>
-        <w:rPr/>
+        <w:rPr>
+          <w:lang w:val="en-US"/>
+        </w:rPr>
       </w:r>
     </w:p>
     <w:p>
@@ -3268,12 +3196,42 @@
     </w:p>
     <w:p>
       <w:pPr>
+        <w:pStyle w:val="Heading2"/>
+        <w:numPr>
+          <w:ilvl w:val="1"/>
+          <w:numId w:val="2"/>
+        </w:numPr>
+        <w:spacing w:before="480" w:after="280"/>
+        <w:rPr/>
+      </w:pPr>
+      <w:r>
+        <w:rPr/>
+        <w:t>Zašto je mrežna sigurnost važna</w:t>
+      </w:r>
+    </w:p>
+    <w:p>
+      <w:pPr>
         <w:pStyle w:val="TextBody"/>
         <w:rPr/>
       </w:pPr>
       <w:r>
         <w:rPr/>
-        <w:t>Ubrzani razvoj informacijskih i komunikacijskih tehnologija, praćen intenzivnom digitalizacijom poslovnih procesa, značajno je promijenio način funkcioniranja suvremenih organizacija. Sve veća zastupljenost cloud usluga, mobilnih uređaja i rada na daljinu dovela je do postupnog nestajanja tradicionalno jasno definiranih mrežnih granica. Posljedično, sigurnosni izazovi postaju složeniji, a postojeći modeli zaštite sve manje učinkoviti u suočavanju s dinamičnim i sofisticiranim kibernetičkim prijetnjama.</w:t>
+        <w:t>Ubrzani razvoj informacijskih i komunikacijskih tehnologija, praćen intenzivnom digitalizacijom poslovnih procesa, značajno je promijenio način funkcioniranja suvremenih organizacija. Sve veća zastupljenost cloud usluga, mobilnih uređaja te rada na daljinu dovela je do postupnog nestajanja tradicionalno jasno definiranih mrežnih granica. Kao posljedica toga, sigurnosni izazovi postaju sve složeniji, a organizacije su izloženije raznovrsnim i sofisticiranim kibernetičkim prijetnjama.</w:t>
+      </w:r>
+    </w:p>
+    <w:p>
+      <w:pPr>
+        <w:pStyle w:val="Heading2"/>
+        <w:numPr>
+          <w:ilvl w:val="1"/>
+          <w:numId w:val="2"/>
+        </w:numPr>
+        <w:spacing w:before="480" w:after="280"/>
+        <w:rPr/>
+      </w:pPr>
+      <w:r>
+        <w:rPr/>
+        <w:t>Problemi modernih sustava</w:t>
       </w:r>
     </w:p>
     <w:p>
@@ -3283,7 +3241,23 @@
       </w:pPr>
       <w:r>
         <w:rPr/>
-        <w:t>Tradicionalni pristupi sigurnosti informacijskih sustava uvelike se oslanjaju na koncept mrežnog perimetra te pretpostavku povjerenja prema korisnicima i uređajima unutar tog okruženja. Međutim, takav model sve teže odgovara na zahtjeve suvremenog digitalnog okruženja, u kojem pristup resursima često nadilazi fizičke i logičke granice organizacije. U tom kontekstu razvija se koncept Zero Trust Network Security, koji predstavlja temeljni zaokret u razumijevanju i implementaciji sigurnosnih mehanizama.</w:t>
+        <w:t>Suvremeni informacijski sustavi temelje se na distribuiranim arhitekturama poput cloud okruženja, mikroservisa i orkestracijskih platformi kao što je Kubernetes. Iako takvi pristupi omogućuju veću skalabilnost i fleksibilnost, istovremeno uvode dodatnu kompleksnost u upravljanju sigurnošću. Dinamična priroda ovih sustava, česte promjene konfiguracija i velik broj međusobno povezanih komponenti otežavaju implementaciju tradicionalnih sigurnosnih mehanizama te povećavaju potencijalnu površinu napada.</w:t>
+      </w:r>
+    </w:p>
+    <w:p>
+      <w:pPr>
+        <w:pStyle w:val="Heading2"/>
+        <w:numPr>
+          <w:ilvl w:val="1"/>
+          <w:numId w:val="2"/>
+        </w:numPr>
+        <w:spacing w:before="480" w:after="280"/>
+        <w:ind w:hanging="0"/>
+        <w:rPr/>
+      </w:pPr>
+      <w:r>
+        <w:rPr/>
+        <w:t>Cilj rada</w:t>
       </w:r>
     </w:p>
     <w:p>
@@ -3293,17 +3267,17 @@
       </w:pPr>
       <w:r>
         <w:rPr/>
-        <w:t>Zero Trust pristup polazi od pretpostavke da se nijednom korisniku, uređaju ili sustavu ne može vjerovati bez prethodne i kontinuirane provjere, neovisno o njihovoj lokaciji. Naglasak se pritom stavlja na strogu kontrolu pristupa, višeslojnu autentifikaciju, načelo najmanjih privilegija te stalni nadzor i analizu aktivnosti unutar sustava. Takav pristup omogućuje smanjenje rizika od neovlaštenog pristupa i potencijalnih sigurnosnih incidenata.</w:t>
-      </w:r>
-    </w:p>
-    <w:p>
-      <w:pPr>
-        <w:pStyle w:val="TextBody"/>
-        <w:rPr/>
-      </w:pPr>
-      <w:r>
-        <w:rPr/>
-        <w:t>Svrha ovog rada je sustavno prikazati temeljna obilježja i načela Zero Trust modela te analizirati njegovu primjenjivost u suvremenim informacijskim sustavima. Posebna pozornost posvetit će se prednostima i izazovima implementacije ovog pristupa, kao i njegovoj ulozi u unapređenju ukupne razine sigurnosti organizacija u uvjetima sve izraženije digitalne transformacije.</w:t>
+        <w:t>Cilj ovog rada je sustavno prikazati temeljna načela i karakteristike Zero Trust modela te analizirati njegovu primjenjivost u suvremenim informacijskim sustavima. Rad će obuhvatiti pregled ključnih sigurnosnih koncepata, kao i usporedbu s tradicionalnim pristupima mrežnoj sigurnosti.</w:t>
+      </w:r>
+      <w:r>
+        <w:rPr>
+          <w:rStyle w:val="StrongEmphasis"/>
+        </w:rPr>
+        <w:t xml:space="preserve"> </w:t>
+      </w:r>
+      <w:r>
+        <w:rPr/>
+        <w:t>U praktičnom dijelu rada demonstrirat će se implementacija Zero Trust pristupa u modernom okruženju temeljenom na mikroservisnoj arhitekturi. Poseban naglasak stavit će se na primjenu autentifikacijskih i autorizacijskih mehanizama, segmentaciju mreže te nadzor komunikacije između servisa, s ciljem smanjenja sigurnosnih rizika i povećanja otpornosti sustava.</w:t>
       </w:r>
     </w:p>
     <w:p>
@@ -3340,31 +3314,23 @@
         <w:spacing w:before="480" w:after="280"/>
         <w:rPr/>
       </w:pPr>
-      <w:bookmarkStart w:id="2" w:name="_Toc213706371"/>
-      <w:r>
-        <w:rPr/>
-        <w:t>Tehnologije/Teoretska podloga</w:t>
-      </w:r>
-      <w:bookmarkEnd w:id="2"/>
-    </w:p>
-    <w:p>
-      <w:pPr>
-        <w:pStyle w:val="Normal"/>
-        <w:rPr/>
-      </w:pPr>
-      <w:r>
-        <w:rPr/>
-        <w:t xml:space="preserve">Lorem ipsum dolor sit amet consectetur adipiscing elit. Quisque faucibus ex sapien vitae pellentesque sem placerat. In id cursus mi pretium tellus duis convallis. Tempus leo eu aenean sed diam urna tempor. Pulvinar vivamus fringilla lacus nec metus bibendum egestas. Iaculis massa nisl malesuada lacinia integer nunc posuere link </w:t>
-      </w:r>
-      <w:r>
-        <w:rPr>
-          <w:rStyle w:val="LinkoviChar"/>
-        </w:rPr>
-        <w:t>https://www.oss.unist.hr</w:t>
-      </w:r>
-      <w:r>
-        <w:rPr/>
-        <w:t>. Ut hendrerit semper vel class aptent taciti sociosqu. Ad litora torquent per conubia nostra inceptos himenaeos.</w:t>
+      <w:r>
+        <w:rPr/>
+        <w:t xml:space="preserve"> </w:t>
+      </w:r>
+      <w:r>
+        <w:rPr/>
+        <w:t>Tehnologije</w:t>
+      </w:r>
+    </w:p>
+    <w:p>
+      <w:pPr>
+        <w:pStyle w:val="Normal"/>
+        <w:rPr/>
+      </w:pPr>
+      <w:r>
+        <w:rPr/>
+        <w:t>U okviru praktičnog dijela rada korišten je skup suvremenih tehnologija koje omogućuju implementaciju i demonstraciju Zero Trust pristupa u distribuiranom sustavu. Odabrane tehnologije obuhvaćaju orkestraciju kontejnera, razvoj aplikacijskih servisa, upravljanje mrežnim prometom te implementaciju sigurnosnih mehanizama unutar mikroservisne arhitekture.</w:t>
       </w:r>
     </w:p>
     <w:p>
@@ -3376,45 +3342,83 @@
         </w:numPr>
         <w:rPr/>
       </w:pPr>
-      <w:bookmarkStart w:id="3" w:name="_Toc213706372"/>
-      <w:r>
-        <w:rPr/>
-        <w:t>Podpoglavlje</w:t>
+      <w:bookmarkStart w:id="2" w:name="_Toc213706372"/>
+      <w:r>
+        <w:rPr/>
+        <w:t>J</w:t>
+      </w:r>
+      <w:bookmarkEnd w:id="2"/>
+      <w:r>
+        <w:rPr/>
+        <w:t xml:space="preserve">ava </w:t>
+      </w:r>
+    </w:p>
+    <w:p>
+      <w:pPr>
+        <w:pStyle w:val="Normal"/>
+        <w:rPr/>
+      </w:pPr>
+      <w:r>
+        <w:rPr/>
+        <w:t>Java je objektno orijentirani programski jezik opće namjene koji se široko koristi u razvoju poslovnih i distribuiranih aplikacij</w:t>
+      </w:r>
+      <w:r>
+        <w:rPr/>
+        <w:t xml:space="preserve">a, </w:t>
+      </w:r>
+      <w:r>
+        <w:rPr/>
+        <w:t>poznata po svojoj portabilnosti, što omogućuje pokretanje aplikacija na različitim platformama putem Java Virtual Machin</w:t>
+      </w:r>
+      <w:r>
+        <w:rPr/>
+        <w:t xml:space="preserve">e (JVM). </w:t>
+      </w:r>
+      <w:r>
+        <w:rPr/>
+        <w:t>Zahvaljujući snažnom ekosustavu, bogatim bibliotekama i dugogodišnjoj stabilnosti, Java je čest izbor za razvoj backend sustava i mikroservisnih arhitektura. Njena robusnost, sigurnosne mogućnosti i podrška za višedretveno programiranje čine je pogodnom za izgradnju skalabilnih i pouzdanih aplikacija u suvremenim informacijskim sustavima.</w:t>
+      </w:r>
+    </w:p>
+    <w:p>
+      <w:pPr>
+        <w:pStyle w:val="Heading2"/>
+        <w:numPr>
+          <w:ilvl w:val="1"/>
+          <w:numId w:val="2"/>
+        </w:numPr>
+        <w:rPr/>
+      </w:pPr>
+      <w:bookmarkStart w:id="3" w:name="_Toc213706375"/>
+      <w:r>
+        <w:rPr/>
+        <w:t>K</w:t>
       </w:r>
       <w:bookmarkEnd w:id="3"/>
-    </w:p>
-    <w:p>
-      <w:pPr>
-        <w:pStyle w:val="Normal"/>
-        <w:rPr/>
-      </w:pPr>
-      <w:r>
-        <w:rPr/>
-        <w:t xml:space="preserve">Lorem ipsum dolor sit amet consectetur adipiscing elit. Quisque faucibus ex sapien vitae pellentesque sem placerat. In id cursus mi pretium tellus duis convallis staza </w:t>
-      </w:r>
-      <w:r>
-        <w:rPr>
-          <w:rStyle w:val="VarijableChar"/>
-        </w:rPr>
-        <w:t>C:\Users\User</w:t>
-      </w:r>
-      <w:r>
-        <w:rPr/>
-        <w:t>. Tempus leo eu aenean sed diam urna tempor. Pulvinar vivamus fringilla lacus nec metus bibendum egestas. Iaculis massa nisl malesuada lacinia integer nunc posuere. Ut hendrerit semper vel class aptent taciti sociosqu (slika 1). Ad litora torquent per conubia nostra inceptos himenaeos.</w:t>
-      </w:r>
-    </w:p>
-    <w:p>
-      <w:pPr>
-        <w:pStyle w:val="Slika"/>
+      <w:r>
+        <w:rPr/>
+        <w:t>ubernetes</w:t>
+      </w:r>
+    </w:p>
+    <w:p>
+      <w:pPr>
+        <w:pStyle w:val="Normal"/>
         <w:rPr/>
       </w:pPr>
       <w:r>
         <w:rPr/>
         <w:drawing>
-          <wp:inline distT="0" distB="0" distL="0" distR="0">
-            <wp:extent cx="3200400" cy="2667000"/>
+          <wp:anchor behindDoc="0" distT="0" distB="0" distL="0" distR="0" simplePos="0" locked="0" layoutInCell="1" allowOverlap="1" relativeHeight="2">
+            <wp:simplePos x="0" y="0"/>
+            <wp:positionH relativeFrom="column">
+              <wp:posOffset>534670</wp:posOffset>
+            </wp:positionH>
+            <wp:positionV relativeFrom="paragraph">
+              <wp:posOffset>24765</wp:posOffset>
+            </wp:positionV>
+            <wp:extent cx="4316095" cy="2943860"/>
             <wp:effectExtent l="0" t="0" r="0" b="0"/>
-            <wp:docPr id="1" name="Picture 1" descr="A grey text with black text&#10;&#10;AI-generated content may be incorrect."/>
+            <wp:wrapSquare wrapText="largest"/>
+            <wp:docPr id="1" name="Image3" descr=""/>
             <wp:cNvGraphicFramePr>
               <a:graphicFrameLocks xmlns:a="http://schemas.openxmlformats.org/drawingml/2006/main" noChangeAspect="1"/>
             </wp:cNvGraphicFramePr>
@@ -3422,7 +3426,7 @@
               <a:graphicData uri="http://schemas.openxmlformats.org/drawingml/2006/picture">
                 <pic:pic xmlns:pic="http://schemas.openxmlformats.org/drawingml/2006/picture">
                   <pic:nvPicPr>
-                    <pic:cNvPr id="1" name="Picture 1" descr="A grey text with black text&#10;&#10;AI-generated content may be incorrect."/>
+                    <pic:cNvPr id="1" name="Image3" descr=""/>
                     <pic:cNvPicPr>
                       <a:picLocks noChangeAspect="1" noChangeArrowheads="1"/>
                     </pic:cNvPicPr>
@@ -3436,7 +3440,7 @@
                   <pic:spPr bwMode="auto">
                     <a:xfrm>
                       <a:off x="0" y="0"/>
-                      <a:ext cx="3200400" cy="2667000"/>
+                      <a:ext cx="4316095" cy="2943860"/>
                     </a:xfrm>
                     <a:prstGeom prst="rect">
                       <a:avLst/>
@@ -3445,35 +3449,55 @@
                 </pic:pic>
               </a:graphicData>
             </a:graphic>
-          </wp:inline>
+          </wp:anchor>
         </w:drawing>
       </w:r>
     </w:p>
     <w:p>
       <w:pPr>
-        <w:pStyle w:val="Slika"/>
-        <w:rPr/>
-      </w:pPr>
-      <w:r>
-        <w:rPr>
-          <w:b/>
-          <w:bCs/>
-        </w:rPr>
-        <w:t>Slika 1</w:t>
-      </w:r>
-      <w:r>
-        <w:rPr/>
-        <w:t>: Naziv slike</w:t>
-      </w:r>
-    </w:p>
-    <w:p>
-      <w:pPr>
-        <w:pStyle w:val="Normal"/>
-        <w:rPr/>
-      </w:pPr>
-      <w:r>
-        <w:rPr/>
-        <w:t>Lorem ipsum dolor sit amet consectetur adipiscing elit. Quisque faucibus ex sapien vitae pellentesque sem placerat. In id cursus mi pretium tellus duis convallis. Tempus leo eu aenean sed diam urna tempor. Pulvinar vivamus fringilla lacus nec metus bibendum egestas. Iaculis massa nisl malesuada lacinia integer nunc posuere. Ut hendrerit semper vel class aptent taciti sociosqu. Ad litora torquent per conubia nostra inceptos himenaeos.</w:t>
+        <w:pStyle w:val="Normal"/>
+        <w:rPr/>
+      </w:pPr>
+      <w:r>
+        <w:rPr/>
+      </w:r>
+    </w:p>
+    <w:p>
+      <w:pPr>
+        <w:pStyle w:val="Normal"/>
+        <w:rPr/>
+      </w:pPr>
+      <w:r>
+        <w:rPr/>
+      </w:r>
+    </w:p>
+    <w:p>
+      <w:pPr>
+        <w:pStyle w:val="Normal"/>
+        <w:rPr/>
+      </w:pPr>
+      <w:r>
+        <w:rPr/>
+      </w:r>
+    </w:p>
+    <w:p>
+      <w:pPr>
+        <w:pStyle w:val="Normal"/>
+        <w:rPr/>
+      </w:pPr>
+      <w:r>
+        <w:rPr/>
+        <w:t>Kubernetes je open-source platforma za orkestraciju kontejnera koja omogućuje automatizirano upravljanje, skaliranje i implementaciju aplikacija u distribuiranim sustavima. Izvorno razvijen od strane Google, Kubernetes je danas jedan od najvažnijih alata u modernom DevOps okruženju.</w:t>
+      </w:r>
+    </w:p>
+    <w:p>
+      <w:pPr>
+        <w:pStyle w:val="Normal"/>
+        <w:rPr/>
+      </w:pPr>
+      <w:r>
+        <w:rPr/>
+        <w:t>Osnovna funkcionalnost Kubernetes platforme uključuje upravljanje kontejnerima, automatsko skaliranje aplikacija, balansiranje opterećenja te osiguravanje visoke dostupnosti sustava. Aplikacije se izvršavaju unutar tzv. podova (pods), koji predstavljaju najmanju jedinicu deploya, dok se komunikacija i upravljanje resursima odvijaju kroz definirane servise i kontrolere.</w:t>
       </w:r>
     </w:p>
     <w:p>
@@ -3485,56 +3509,52 @@
         </w:numPr>
         <w:rPr/>
       </w:pPr>
-      <w:bookmarkStart w:id="4" w:name="_Toc213706373"/>
-      <w:r>
-        <w:rPr/>
-        <w:t>Podpoglavlje</w:t>
-      </w:r>
-      <w:bookmarkEnd w:id="4"/>
-    </w:p>
-    <w:p>
-      <w:pPr>
-        <w:pStyle w:val="Normal"/>
-        <w:rPr/>
-      </w:pPr>
-      <w:r>
-        <w:rPr/>
-        <w:t>Lorem ipsum dolor sit amet consectetur adipiscing elit. Quisque faucibus ex sapien vitae pellentesque sem placerat. In id cursus mi pretium tellus duis convallis. Tempus leo eu aenean sed diam urna tempor. Pulvinar vivamus fringilla lacus nec metus bibendum egestas. Iaculis massa nisl malesuada lacinia integer nunc posuere. Ut hendrerit semper vel class aptent taciti sociosqu. Ad litora torquent per conubia nostra inceptos himenaeos.</w:t>
-      </w:r>
-    </w:p>
-    <w:p>
-      <w:pPr>
-        <w:pStyle w:val="Heading3"/>
-        <w:numPr>
-          <w:ilvl w:val="2"/>
-          <w:numId w:val="2"/>
-        </w:numPr>
-        <w:rPr/>
-      </w:pPr>
-      <w:bookmarkStart w:id="5" w:name="_Toc213706374"/>
-      <w:r>
-        <w:rPr/>
-        <w:t>Podpoglavlje</w:t>
-      </w:r>
-      <w:bookmarkEnd w:id="5"/>
-    </w:p>
-    <w:p>
-      <w:pPr>
-        <w:pStyle w:val="Normal"/>
-        <w:rPr/>
-      </w:pPr>
-      <w:r>
-        <w:rPr/>
-        <w:t>Lorem ipsum dolor sit amet consectetur adipiscing elit. Quisque faucibus ex sapien vitae pellentesque sem placerat. In id cursus mi pretium tellus duis convallis. Tempus leo eu aenean sed diam urna tempor. Pulvinar vivamus fringilla lacus nec metus bibendum egestas. Iaculis massa nisl malesuada lacinia integer nunc posuere. Ut hendrerit semper vel class aptent taciti sociosqu. Ad litora torquent per conubia nostra inceptos himenaeos.</w:t>
-      </w:r>
-    </w:p>
-    <w:p>
-      <w:pPr>
-        <w:pStyle w:val="Normal"/>
-        <w:rPr/>
-      </w:pPr>
-      <w:r>
-        <w:rPr/>
+      <w:r>
+        <w:rPr/>
+        <w:t>Minikube</w:t>
+      </w:r>
+    </w:p>
+    <w:p>
+      <w:pPr>
+        <w:pStyle w:val="TextBody"/>
+        <w:spacing w:lineRule="auto" w:line="360"/>
+        <w:rPr/>
+      </w:pPr>
+      <w:r>
+        <w:rPr/>
+        <w:t>Minikube je alat koji omogućuje lokalno pokretanje Kubernetes klastera na jednoj fizičkoj ili virtualnoj mašini. Namijenjen je prvenstveno za razvoj, testiranje i edukaciju, jer omogućuje korisnicima da implementiraju i analiziraju ponašanje Kubernetes okruženja bez potrebe za složenom i distribuiranom infrastrukturom.</w:t>
+      </w:r>
+    </w:p>
+    <w:p>
+      <w:pPr>
+        <w:pStyle w:val="TextBody"/>
+        <w:spacing w:lineRule="auto" w:line="360"/>
+        <w:rPr/>
+      </w:pPr>
+      <w:r>
+        <w:rPr/>
+        <w:t xml:space="preserve">Klaster u kontekstu Kubernetesa predstavlja skup međusobno povezanih računalnih čvorova (engl. </w:t>
+      </w:r>
+      <w:r>
+        <w:rPr>
+          <w:rStyle w:val="Emphasis"/>
+        </w:rPr>
+        <w:t>nodes</w:t>
+      </w:r>
+      <w:r>
+        <w:rPr/>
+        <w:t>) koji zajedno čine jedinstveno okruženje za izvršavanje i upravljanje kontejnerskim aplikacijama. Svaki klaster sastoji se od upravljačkog dijela (control plane), koji je zadužen za donošenje odluka i upravljanje resursima, te radnih čvorova (worker nodes), na kojima se izvršavaju aplikacije unutar tzv. podova (pods).</w:t>
+      </w:r>
+    </w:p>
+    <w:p>
+      <w:pPr>
+        <w:pStyle w:val="TextBody"/>
+        <w:spacing w:lineRule="auto" w:line="360"/>
+        <w:rPr/>
+      </w:pPr>
+      <w:r>
+        <w:rPr/>
+        <w:t>Minikube implementira ovakav klaster u pojednostavljenom obliku, pri čemu se sve komponente izvode na jednom čvoru. Time se omogućuje realistično testiranje konfiguracija, mrežnih pravila i sigurnosnih mehanizama, što je posebno korisno u kontekstu razvoja i validacije Zero Trust pristupa.</w:t>
       </w:r>
     </w:p>
     <w:p>
@@ -3546,41 +3566,37 @@
         </w:numPr>
         <w:rPr/>
       </w:pPr>
-      <w:bookmarkStart w:id="6" w:name="_Toc213706375"/>
-      <w:r>
-        <w:rPr/>
-        <w:t>Podpoglavlje</w:t>
-      </w:r>
-      <w:bookmarkEnd w:id="6"/>
-    </w:p>
-    <w:p>
-      <w:pPr>
-        <w:pStyle w:val="Normal"/>
-        <w:rPr/>
-      </w:pPr>
-      <w:r>
-        <w:rPr/>
-        <w:t>Lorem ipsum dolor sit amet consectetur adipiscing elit. Quisque faucibus ex sapien vitae pellentesque sem placerat. In id cursus mi pretium tellus duis convallis. Tempus leo eu aenean sed diam urna tempor. Pulvinar vivamus fringilla lacus nec metus bibendum egestas. Iaculis massa nisl malesuada lacinia integer nunc posuere. Ut hendrerit semper vel class aptent taciti sociosqu. Ad litora torquent per conubia nostra inceptos himenaeos.</w:t>
-      </w:r>
-    </w:p>
-    <w:p>
-      <w:pPr>
-        <w:pStyle w:val="Normal"/>
-        <w:rPr/>
-      </w:pPr>
-      <w:r>
-        <w:rPr/>
-        <w:t>Lorem ipsum dolor sit amet consectetur adipiscing elit. Quisque faucibus ex sapien vitae pellentesque sem placerat. In id cursus mi pretium tellus duis convallis. Tempus leo eu aenean sed diam urna tempor. Pulvinar vivamus fringilla lacus nec metus bibendum egestas. Iaculis massa nisl malesuada lacinia integer nunc posuere. Ut hendrerit semper vel class aptent taciti sociosqu. Ad litora torquent per conubia nostra inceptos himenaeos.</w:t>
-      </w:r>
-    </w:p>
-    <w:p>
-      <w:pPr>
-        <w:pStyle w:val="Normal"/>
-        <w:rPr/>
-      </w:pPr>
-      <w:r>
-        <w:rPr/>
-        <w:t>Lorem ipsum dolor sit amet consectetur adipiscing elit. Quisque faucibus ex sapien vitae pellentesque sem placerat. In id cursus mi pretium tellus duis convallis. Tempus leo eu aenean sed diam urna tempor. Pulvinar vivamus fringilla lacus nec metus bibendum egestas. Iaculis massa nisl malesuada lacinia integer nunc posuere. Ut hendrerit semper vel class aptent taciti sociosqu. Ad litora torquent per conubia nostra inceptos himenaeos.</w:t>
+      <w:bookmarkStart w:id="4" w:name="_Toc213706376"/>
+      <w:r>
+        <w:rPr/>
+        <w:t>S</w:t>
+      </w:r>
+      <w:bookmarkEnd w:id="4"/>
+      <w:r>
+        <w:rPr/>
+        <w:t>ervice Mesh</w:t>
+      </w:r>
+    </w:p>
+    <w:p>
+      <w:pPr>
+        <w:pStyle w:val="TextBody"/>
+        <w:spacing w:lineRule="auto" w:line="360"/>
+        <w:rPr/>
+      </w:pPr>
+      <w:r>
+        <w:rPr/>
+        <w:t>Service Mesh predstavlja infrastrukturni sloj unutar mikroservisne arhitekture koji je zadužen za upravljanje komunikacijom između servisa. Njegova osnovna svrha je omogućiti sigurnu, pouzdanu i kontroliranu razmjenu podataka između distribuiranih komponenti sustava, bez potrebe za implementacijom tih funkcionalnosti unutar same aplikacijske logike.</w:t>
+      </w:r>
+    </w:p>
+    <w:p>
+      <w:pPr>
+        <w:pStyle w:val="TextBody"/>
+        <w:spacing w:lineRule="auto" w:line="360"/>
+        <w:rPr/>
+      </w:pPr>
+      <w:r>
+        <w:rPr/>
+        <w:t>S obzirom na njegovu složenost i značaj u kontekstu modernih distribuiranih sustava, service mesh će u okviru ovog rada biti obrađen kao zasebna tematska cjelina. U ovom poglavlju daje se samo kratki pregled njegove uloge, dok će se detaljna analiza arhitekture, principa rada i primjene u sigurnosnim modelima, uključujući Zero Trust pristup, razmatrati u zasebnom poglavlju.</w:t>
       </w:r>
     </w:p>
     <w:p>
@@ -3590,28 +3606,6 @@
           <w:ilvl w:val="1"/>
           <w:numId w:val="2"/>
         </w:numPr>
-        <w:rPr/>
-      </w:pPr>
-      <w:bookmarkStart w:id="7" w:name="_Toc213706376"/>
-      <w:r>
-        <w:rPr/>
-        <w:t>Podpoglavlje</w:t>
-      </w:r>
-      <w:bookmarkEnd w:id="7"/>
-    </w:p>
-    <w:p>
-      <w:pPr>
-        <w:pStyle w:val="Normal"/>
-        <w:rPr/>
-      </w:pPr>
-      <w:r>
-        <w:rPr/>
-        <w:t>Lorem ipsum dolor sit amet consectetur adipiscing elit. Quisque faucibus ex sapien vitae pellentesque sem placerat. In id cursus mi pretium tellus duis convallis. Tempus leo eu aenean sed diam urna tempor. Pulvinar vivamus fringilla lacus nec metus bibendum egestas. Iaculis massa nisl malesuada lacinia integer nunc posuere. Ut hendrerit semper vel class aptent taciti sociosqu. Ad litora torquent per conubia nostra inceptos himenaeos.</w:t>
-      </w:r>
-    </w:p>
-    <w:p>
-      <w:pPr>
-        <w:pStyle w:val="Normal"/>
         <w:spacing w:lineRule="auto" w:line="259" w:before="0" w:after="160"/>
         <w:ind w:hanging="0"/>
         <w:jc w:val="left"/>
@@ -3619,87 +3613,214 @@
           <w:rFonts w:ascii="Arial" w:hAnsi="Arial" w:eastAsia="等线 Light" w:cs="Times New Roman" w:cstheme="majorBidi" w:eastAsiaTheme="majorEastAsia"/>
           <w:b/>
           <w:b/>
-          <w:sz w:val="36"/>
-          <w:szCs w:val="40"/>
-        </w:rPr>
-      </w:pPr>
-      <w:r>
-        <w:rPr>
-          <w:rFonts w:eastAsia="等线 Light" w:cs="Times New Roman" w:cstheme="majorBidi" w:eastAsiaTheme="majorEastAsia" w:ascii="Arial" w:hAnsi="Arial"/>
+          <w:sz w:val="28"/>
+          <w:szCs w:val="28"/>
+        </w:rPr>
+      </w:pPr>
+      <w:bookmarkStart w:id="5" w:name="_Toc2137063762"/>
+      <w:r>
+        <w:rPr>
+          <w:rFonts w:eastAsia="等线 Light" w:cs="Times New Roman" w:cstheme="majorBidi" w:eastAsiaTheme="majorEastAsia"/>
           <w:b/>
-          <w:sz w:val="36"/>
-          <w:szCs w:val="40"/>
-        </w:rPr>
-      </w:r>
-      <w:r>
-        <w:br w:type="page"/>
-      </w:r>
-    </w:p>
-    <w:p>
-      <w:pPr>
-        <w:pStyle w:val="Heading1"/>
-        <w:numPr>
-          <w:ilvl w:val="0"/>
-          <w:numId w:val="2"/>
-        </w:numPr>
-        <w:spacing w:before="480" w:after="280"/>
-        <w:rPr/>
-      </w:pPr>
-      <w:bookmarkStart w:id="8" w:name="_Toc213706377"/>
-      <w:r>
-        <w:rPr/>
-        <w:t>Prikaz praktičnog dijela</w:t>
-      </w:r>
-      <w:bookmarkEnd w:id="8"/>
-    </w:p>
-    <w:p>
-      <w:pPr>
-        <w:pStyle w:val="Normal"/>
-        <w:rPr/>
-      </w:pPr>
-      <w:r>
-        <w:rPr/>
-        <w:t>Lorem ipsum dolor sit amet consectetur adipiscing elit. Quisque faucibus ex sapien vitae pellentesque sem placerat. In id cursus mi pretium tellus duis convallis. Tempus leo eu aenean sed diam urna tempor. Pulvinar vivamus fringilla lacus nec metus bibendum egestas. Iaculis massa nisl malesuada lacinia integer nunc posuere. Ut hendrerit semper vel class aptent taciti sociosqu. Ad litora torquent per conubia nostra inceptos himenaeos.</w:t>
-      </w:r>
-    </w:p>
-    <w:p>
-      <w:pPr>
-        <w:pStyle w:val="Heading2"/>
-        <w:numPr>
-          <w:ilvl w:val="1"/>
-          <w:numId w:val="2"/>
-        </w:numPr>
-        <w:rPr/>
-      </w:pPr>
-      <w:bookmarkStart w:id="9" w:name="_Toc213706378"/>
-      <w:r>
-        <w:rPr/>
-        <w:t>Podpoglavlje</w:t>
-      </w:r>
-      <w:bookmarkEnd w:id="9"/>
-    </w:p>
-    <w:p>
-      <w:pPr>
-        <w:pStyle w:val="Normal"/>
-        <w:rPr/>
-      </w:pPr>
-      <w:r>
-        <w:rPr/>
-        <w:t>Lorem ipsum dolor sit amet consectetur adipiscing elit. Quisque faucibus ex sapien vitae pellentesque sem placerat. In id cursus mi pretium tellus duis convallis. Tempus leo eu aenean sed diam urna tempor. Pulvinar vivamus fringilla lacus nec metus bibendum egestas. Iaculis massa nisl malesuada lacinia integer nunc posuere. Ut hendrerit semper vel class aptent taciti sociosqu. Ad litora torquent per conubia nostra inceptos himenaeos (slika 2).</w:t>
-      </w:r>
-    </w:p>
-    <w:p>
-      <w:pPr>
-        <w:pStyle w:val="Slika"/>
-        <w:rPr/>
-      </w:pPr>
-      <w:r>
-        <w:rPr/>
+          <w:sz w:val="28"/>
+          <w:szCs w:val="28"/>
+        </w:rPr>
+        <w:t>N</w:t>
+      </w:r>
+      <w:bookmarkEnd w:id="5"/>
+      <w:r>
+        <w:rPr>
+          <w:rFonts w:eastAsia="等线 Light" w:cs="Times New Roman" w:cstheme="majorBidi" w:eastAsiaTheme="majorEastAsia"/>
+          <w:b/>
+          <w:sz w:val="28"/>
+          <w:szCs w:val="28"/>
+        </w:rPr>
+        <w:t>ginx</w:t>
+      </w:r>
+    </w:p>
+    <w:p>
+      <w:pPr>
+        <w:pStyle w:val="TextBody"/>
+        <w:spacing w:lineRule="auto" w:line="360" w:before="0" w:after="160"/>
+        <w:ind w:hanging="0"/>
+        <w:jc w:val="left"/>
+        <w:rPr/>
+      </w:pPr>
+      <w:r>
+        <w:rPr>
+          <w:rFonts w:eastAsia="等线 Light" w:cs="Times New Roman" w:ascii="Times New Roman" w:hAnsi="Times New Roman" w:cstheme="majorBidi" w:eastAsiaTheme="majorEastAsia"/>
+          <w:b w:val="false"/>
+          <w:bCs w:val="false"/>
+          <w:sz w:val="24"/>
+          <w:szCs w:val="24"/>
+          <w:u w:val="none"/>
+        </w:rPr>
+        <w:tab/>
+        <w:t>NGINX je visoko performantni web poslužitelj i reverse proxy server koji se široko koristi u modernim mrežnim i distribuiranim arhitekturama. Osnovna funkcija NGINX-a je obrada i usmjeravanje HTTP/HTTPS zahtjeva prema odgovarajućim backend servisima, uz učinkovito upravljanje opterećenjem i resursima sustava.</w:t>
+      </w:r>
+    </w:p>
+    <w:p>
+      <w:pPr>
+        <w:pStyle w:val="TextBody"/>
+        <w:spacing w:lineRule="auto" w:line="360"/>
+        <w:rPr/>
+      </w:pPr>
+      <w:r>
+        <w:rPr/>
+        <w:t>NGINX podržava implementaciju sigurnosnih mehanizama kao što su TLS terminacija, kontrola pristupa te filtriranje zahtjeva, što ga čini važnom komponentom u arhitekturama koje se temelje na distribuiranim servisima i Zero Trust principima.</w:t>
+      </w:r>
+    </w:p>
+    <w:p>
+      <w:pPr>
+        <w:pStyle w:val="TextBody"/>
+        <w:spacing w:lineRule="auto" w:line="360"/>
+        <w:rPr/>
+      </w:pPr>
+      <w:r>
+        <w:rPr/>
+        <w:t>U okviru ovog rada, NGINX se koristi kao ključna infrastrukturalna komponenta za upravljanje mrežnim prometom i izlaganje servisa, dok će se njegova detaljna konfiguracija i implementacija prikazati u praktičnom dijelu rada.</w:t>
+      </w:r>
+    </w:p>
+    <w:p>
+      <w:pPr>
+        <w:pStyle w:val="Normal"/>
+        <w:spacing w:lineRule="auto" w:line="259" w:before="0" w:after="160"/>
+        <w:ind w:hanging="0"/>
+        <w:jc w:val="left"/>
+        <w:rPr/>
+      </w:pPr>
+      <w:r>
+        <w:rPr/>
+        <mc:AlternateContent>
+          <mc:Choice Requires="wps">
+            <w:drawing>
+              <wp:anchor behindDoc="0" distT="0" distB="0" distL="0" distR="0" simplePos="0" locked="0" layoutInCell="1" allowOverlap="1" relativeHeight="6">
+                <wp:simplePos x="0" y="0"/>
+                <wp:positionH relativeFrom="column">
+                  <wp:posOffset>1715770</wp:posOffset>
+                </wp:positionH>
+                <wp:positionV relativeFrom="paragraph">
+                  <wp:posOffset>3444875</wp:posOffset>
+                </wp:positionV>
+                <wp:extent cx="2350135" cy="343535"/>
+                <wp:effectExtent l="0" t="0" r="0" b="0"/>
+                <wp:wrapNone/>
+                <wp:docPr id="2" name="Shape1"/>
+                <a:graphic xmlns:a="http://schemas.openxmlformats.org/drawingml/2006/main">
+                  <a:graphicData uri="http://schemas.microsoft.com/office/word/2010/wordprocessingShape">
+                    <wps:wsp>
+                      <wps:cNvSpPr txBox="1"/>
+                      <wps:spPr>
+                        <a:xfrm>
+                          <a:off x="0" y="0"/>
+                          <a:ext cx="2349360" cy="343080"/>
+                        </a:xfrm>
+                        <a:prstGeom prst="rect">
+                          <a:avLst/>
+                        </a:prstGeom>
+                        <a:noFill/>
+                        <a:ln>
+                          <a:noFill/>
+                        </a:ln>
+                      </wps:spPr>
+                      <wps:txbx>
+                        <w:txbxContent>
+                          <w:p>
+                            <w:pPr>
+                              <w:overflowPunct w:val="false"/>
+                              <w:spacing w:before="0" w:after="0" w:lineRule="auto" w:line="240"/>
+                              <w:ind w:hanging="0"/>
+                              <w:jc w:val="center"/>
+                              <w:rPr/>
+                            </w:pPr>
+                            <w:r>
+                              <w:rPr>
+                                <w:b/>
+                                <w:bCs/>
+                                <w:sz w:val="24"/>
+                                <w:rFonts w:asciiTheme="minorHAnsi" w:cstheme="minorBidi" w:eastAsiaTheme="minorHAnsi" w:hAnsiTheme="minorHAnsi" w:ascii="Times New Roman" w:hAnsi="Times New Roman"/>
+                                <w14:ligatures w14:val="standardContextual"/>
+                              </w:rPr>
+                              <w:t>Slika 1:</w:t>
+                            </w:r>
+                            <w:r>
+                              <w:rPr>
+                                <w:sz w:val="24"/>
+                                <w:rFonts w:asciiTheme="minorHAnsi" w:cstheme="minorBidi" w:eastAsiaTheme="minorHAnsi" w:hAnsiTheme="minorHAnsi" w:ascii="Times New Roman" w:hAnsi="Times New Roman"/>
+                                <w14:ligatures w14:val="standardContextual"/>
+                              </w:rPr>
+                              <w:t xml:space="preserve"> NGINX model</w:t>
+                            </w:r>
+                          </w:p>
+                        </w:txbxContent>
+                      </wps:txbx>
+                      <wps:bodyPr wrap="square" lIns="0" rIns="0" tIns="0" bIns="0">
+                        <a:spAutoFit/>
+                      </wps:bodyPr>
+                    </wps:wsp>
+                  </a:graphicData>
+                </a:graphic>
+              </wp:anchor>
+            </w:drawing>
+          </mc:Choice>
+          <mc:Fallback>
+            <w:pict>
+              <v:shapetype id="_x0000_t202" coordsize="21600,21600" o:spt="202" path="m,l,21600l21600,21600l21600,xe">
+                <v:stroke joinstyle="miter"/>
+                <v:path gradientshapeok="t" o:connecttype="rect"/>
+              </v:shapetype>
+              <v:shape id="shape_0" ID="Shape1" stroked="f" style="position:absolute;margin-left:135.1pt;margin-top:271.25pt;width:184.95pt;height:26.95pt" type="shapetype_202">
+                <v:textbox>
+                  <w:txbxContent>
+                    <w:p>
+                      <w:pPr>
+                        <w:overflowPunct w:val="false"/>
+                        <w:spacing w:before="0" w:after="0" w:lineRule="auto" w:line="240"/>
+                        <w:ind w:hanging="0"/>
+                        <w:jc w:val="center"/>
+                        <w:rPr/>
+                      </w:pPr>
+                      <w:r>
+                        <w:rPr>
+                          <w:b/>
+                          <w:bCs/>
+                          <w:sz w:val="24"/>
+                          <w:rFonts w:asciiTheme="minorHAnsi" w:cstheme="minorBidi" w:eastAsiaTheme="minorHAnsi" w:hAnsiTheme="minorHAnsi" w:ascii="Times New Roman" w:hAnsi="Times New Roman"/>
+                          <w14:ligatures w14:val="standardContextual"/>
+                        </w:rPr>
+                        <w:t>Slika 1:</w:t>
+                      </w:r>
+                      <w:r>
+                        <w:rPr>
+                          <w:sz w:val="24"/>
+                          <w:rFonts w:asciiTheme="minorHAnsi" w:cstheme="minorBidi" w:eastAsiaTheme="minorHAnsi" w:hAnsiTheme="minorHAnsi" w:ascii="Times New Roman" w:hAnsi="Times New Roman"/>
+                          <w14:ligatures w14:val="standardContextual"/>
+                        </w:rPr>
+                        <w:t xml:space="preserve"> NGINX model</w:t>
+                      </w:r>
+                    </w:p>
+                  </w:txbxContent>
+                </v:textbox>
+                <w10:wrap type="square"/>
+                <v:fill o:detectmouseclick="t" on="false"/>
+                <v:stroke color="black" joinstyle="round" endcap="flat"/>
+              </v:shape>
+            </w:pict>
+          </mc:Fallback>
+        </mc:AlternateContent>
         <w:drawing>
-          <wp:inline distT="0" distB="0" distL="0" distR="0">
-            <wp:extent cx="3200400" cy="2667000"/>
+          <wp:anchor behindDoc="0" distT="0" distB="0" distL="0" distR="0" simplePos="0" locked="0" layoutInCell="1" allowOverlap="1" relativeHeight="5">
+            <wp:simplePos x="0" y="0"/>
+            <wp:positionH relativeFrom="column">
+              <wp:posOffset>1382395</wp:posOffset>
+            </wp:positionH>
+            <wp:positionV relativeFrom="paragraph">
+              <wp:posOffset>381000</wp:posOffset>
+            </wp:positionV>
+            <wp:extent cx="2865120" cy="2865120"/>
             <wp:effectExtent l="0" t="0" r="0" b="0"/>
-            <wp:docPr id="2" name="Image1" descr="A grey text with black text&#10;&#10;AI-generated content may be incorrect."/>
+            <wp:wrapSquare wrapText="largest"/>
+            <wp:docPr id="3" name="Image5" descr=""/>
             <wp:cNvGraphicFramePr>
               <a:graphicFrameLocks xmlns:a="http://schemas.openxmlformats.org/drawingml/2006/main" noChangeAspect="1"/>
             </wp:cNvGraphicFramePr>
@@ -3707,7 +3828,7 @@
               <a:graphicData uri="http://schemas.openxmlformats.org/drawingml/2006/picture">
                 <pic:pic xmlns:pic="http://schemas.openxmlformats.org/drawingml/2006/picture">
                   <pic:nvPicPr>
-                    <pic:cNvPr id="2" name="Image1" descr="A grey text with black text&#10;&#10;AI-generated content may be incorrect."/>
+                    <pic:cNvPr id="3" name="Image5" descr=""/>
                     <pic:cNvPicPr>
                       <a:picLocks noChangeAspect="1" noChangeArrowheads="1"/>
                     </pic:cNvPicPr>
@@ -3721,7 +3842,7 @@
                   <pic:spPr bwMode="auto">
                     <a:xfrm>
                       <a:off x="0" y="0"/>
-                      <a:ext cx="3200400" cy="2667000"/>
+                      <a:ext cx="2865120" cy="2865120"/>
                     </a:xfrm>
                     <a:prstGeom prst="rect">
                       <a:avLst/>
@@ -3730,45 +3851,42 @@
                 </pic:pic>
               </a:graphicData>
             </a:graphic>
-          </wp:inline>
+          </wp:anchor>
         </w:drawing>
       </w:r>
-    </w:p>
-    <w:p>
-      <w:pPr>
-        <w:pStyle w:val="Slika"/>
-        <w:rPr/>
-      </w:pPr>
-      <w:r>
-        <w:rPr>
-          <w:b/>
-          <w:bCs/>
-        </w:rPr>
-        <w:t>Slika 2</w:t>
-      </w:r>
-      <w:r>
-        <w:rPr/>
-        <w:t>: Naziv slike</w:t>
-      </w:r>
-    </w:p>
-    <w:p>
-      <w:pPr>
-        <w:pStyle w:val="Normal"/>
-        <w:rPr/>
-      </w:pPr>
-      <w:r>
-        <w:rPr/>
-        <w:t>Lorem ipsum dolor sit amet consectetur adipiscing elit. Quisque faucibus ex sapien vitae pellentesque sem placerat. In id cursus mi pretium tellus duis convallis. Tempus leo eu aenean sed diam urna tempor. Pulvinar vivamus fringilla lacus nec metus bibendum egestas. Iaculis massa nisl malesuada lacinia integer nunc posuere. Ut hendrerit semper vel class aptent taciti sociosqu. Ad litora torquent per conubia nostra inceptos himenaeos.</w:t>
-      </w:r>
-    </w:p>
-    <w:p>
-      <w:pPr>
-        <w:pStyle w:val="Normal"/>
-        <w:rPr/>
-      </w:pPr>
-      <w:r>
-        <w:rPr/>
-        <w:t>Lorem ipsum dolor sit amet consectetur adipiscing elit. Quisque faucibus ex sapien vitae pellentesque sem placerat. In id cursus mi pretium tellus duis convallis. Tempus leo eu aenean sed diam urna tempor. Pulvinar vivamus fringilla lacus nec metus bibendum egestas. Iaculis massa nisl malesuada lacinia integer nunc posuere. Ut hendrerit semper vel class aptent taciti sociosqu. Ad litora torquent per conubia nostra inceptos himenaeos.</w:t>
+      <w:r>
+        <w:br w:type="page"/>
+      </w:r>
+    </w:p>
+    <w:p>
+      <w:pPr>
+        <w:pStyle w:val="Heading1"/>
+        <w:numPr>
+          <w:ilvl w:val="0"/>
+          <w:numId w:val="2"/>
+        </w:numPr>
+        <w:spacing w:before="480" w:after="280"/>
+        <w:rPr/>
+      </w:pPr>
+      <w:bookmarkStart w:id="6" w:name="_Toc213706377"/>
+      <w:r>
+        <w:rPr/>
+        <w:t xml:space="preserve"> </w:t>
+      </w:r>
+      <w:bookmarkEnd w:id="6"/>
+      <w:r>
+        <w:rPr/>
+        <w:t>Evolucija mrežne sigurnosti</w:t>
+      </w:r>
+    </w:p>
+    <w:p>
+      <w:pPr>
+        <w:pStyle w:val="Normal"/>
+        <w:rPr/>
+      </w:pPr>
+      <w:r>
+        <w:rPr/>
+        <w:t>Razvoj mrežne sigurnosti usko je povezan s promjenama u arhitekturi informacijskih sustava i načinu korištenja digitalnih resursa. Od centraliziranih i statičnih mrežnih okruženja, sigurnosni modeli evoluirali su prema distribuiranim, dinamičnim i visoko povezanima sustavima, što je dovelo do potrebe za novim pristupima zaštiti podataka i infrastrukture.</w:t>
       </w:r>
     </w:p>
     <w:p>
@@ -3780,45 +3898,48 @@
         </w:numPr>
         <w:rPr/>
       </w:pPr>
-      <w:bookmarkStart w:id="10" w:name="_Toc213706379"/>
-      <w:r>
-        <w:rPr/>
-        <w:t>Podpoglavlje</w:t>
-      </w:r>
-      <w:bookmarkEnd w:id="10"/>
-    </w:p>
-    <w:p>
-      <w:pPr>
-        <w:pStyle w:val="Normal"/>
-        <w:rPr/>
-      </w:pPr>
-      <w:r>
-        <w:rPr/>
-        <w:t>Lorem ipsum dolor sit amet consectetur adipiscing elit. Quisque faucibus ex sapien vitae pellentesque sem placerat. In id cursus mi pretium tellus duis convallis. Tempus leo eu aenean sed diam urna tempor. Pulvinar vivamus fringilla lacus nec metus bibendum egestas. Iaculis massa nisl malesuada lacinia integer nunc posuere. Ut hendrerit semper vel class aptent taciti sociosqu. Ad litora torquent per conubia nostra inceptos himenaeos.</w:t>
-      </w:r>
-    </w:p>
-    <w:p>
-      <w:pPr>
-        <w:pStyle w:val="Normal"/>
-        <w:rPr/>
-      </w:pPr>
-      <w:r>
-        <w:rPr/>
-        <w:t>Lorem ipsum dolor sit amet consectetur adipiscing elit. Quisque faucibus ex sapien vitae pellentesque sem placerat. In id cursus mi pretium tellus duis convallis. Tempus leo eu aenean sed diam urna tempor (slika 3). Pulvinar vivamus fringilla lacus nec metus bibendum egestas. Iaculis massa nisl malesuada lacinia integer nunc posuere. Ut hendrerit semper vel class aptent taciti sociosqu. Ad litora torquent per conubia nostra inceptos himenaeos.</w:t>
+      <w:bookmarkStart w:id="7" w:name="_Toc213706378"/>
+      <w:r>
+        <w:rPr/>
+        <w:t>T</w:t>
+      </w:r>
+      <w:bookmarkEnd w:id="7"/>
+      <w:r>
+        <w:rPr/>
+        <w:t>radicionalni model</w:t>
+      </w:r>
+    </w:p>
+    <w:p>
+      <w:pPr>
+        <w:pStyle w:val="Normal"/>
+        <w:spacing w:lineRule="auto" w:line="360"/>
+        <w:rPr/>
+      </w:pPr>
+      <w:r>
+        <w:rPr/>
+        <w:t>Tradicionalni model mrežne sigurnosti, često opisan kao “castle-and-moat” pristup, temelji se na konceptu perimetarske zaštite informacijskog sustava. U takvom modelu sigurnosni mehanizmi, poput vatrozida i VPN rješenja, koncentrirani su na granici mreže s ciljem sprječavanja neovlaštenog pristupa iz vanjskih izvora, dok se unutar mreže pretpostavlja implicitno povjerenje u korisnike, uređaje i servise.</w:t>
       </w:r>
     </w:p>
     <w:p>
       <w:pPr>
         <w:pStyle w:val="Slika"/>
-        <w:rPr/>
-      </w:pPr>
-      <w:r>
-        <w:rPr/>
+        <w:spacing w:lineRule="auto" w:line="360"/>
+        <w:rPr/>
+      </w:pPr>
+      <w:r>
         <w:drawing>
-          <wp:inline distT="0" distB="0" distL="0" distR="0">
-            <wp:extent cx="3200400" cy="2667000"/>
+          <wp:anchor behindDoc="0" distT="0" distB="0" distL="0" distR="0" simplePos="0" locked="0" layoutInCell="1" allowOverlap="1" relativeHeight="3">
+            <wp:simplePos x="0" y="0"/>
+            <wp:positionH relativeFrom="column">
+              <wp:posOffset>186690</wp:posOffset>
+            </wp:positionH>
+            <wp:positionV relativeFrom="paragraph">
+              <wp:posOffset>221615</wp:posOffset>
+            </wp:positionV>
+            <wp:extent cx="5429250" cy="2540000"/>
             <wp:effectExtent l="0" t="0" r="0" b="0"/>
-            <wp:docPr id="3" name="Image2" descr="A grey text with black text&#10;&#10;AI-generated content may be incorrect."/>
+            <wp:wrapSquare wrapText="largest"/>
+            <wp:docPr id="4" name="Image4" descr=""/>
             <wp:cNvGraphicFramePr>
               <a:graphicFrameLocks xmlns:a="http://schemas.openxmlformats.org/drawingml/2006/main" noChangeAspect="1"/>
             </wp:cNvGraphicFramePr>
@@ -3826,7 +3947,7 @@
               <a:graphicData uri="http://schemas.openxmlformats.org/drawingml/2006/picture">
                 <pic:pic xmlns:pic="http://schemas.openxmlformats.org/drawingml/2006/picture">
                   <pic:nvPicPr>
-                    <pic:cNvPr id="3" name="Image2" descr="A grey text with black text&#10;&#10;AI-generated content may be incorrect."/>
+                    <pic:cNvPr id="4" name="Image4" descr=""/>
                     <pic:cNvPicPr>
                       <a:picLocks noChangeAspect="1" noChangeArrowheads="1"/>
                     </pic:cNvPicPr>
@@ -3840,7 +3961,7 @@
                   <pic:spPr bwMode="auto">
                     <a:xfrm>
                       <a:off x="0" y="0"/>
-                      <a:ext cx="3200400" cy="2667000"/>
+                      <a:ext cx="5429250" cy="2540000"/>
                     </a:xfrm>
                     <a:prstGeom prst="rect">
                       <a:avLst/>
@@ -3849,35 +3970,454 @@
                 </pic:pic>
               </a:graphicData>
             </a:graphic>
-          </wp:inline>
+          </wp:anchor>
         </w:drawing>
       </w:r>
-    </w:p>
-    <w:p>
-      <w:pPr>
-        <w:pStyle w:val="Slika"/>
-        <w:rPr/>
-      </w:pPr>
       <w:r>
         <w:rPr>
           <w:b/>
           <w:bCs/>
         </w:rPr>
+        <w:t>Slika 2</w:t>
+      </w:r>
+      <w:r>
+        <w:rPr/>
+        <w:t xml:space="preserve">: </w:t>
+      </w:r>
+      <w:r>
+        <w:rPr/>
+        <w:t>Tradicionalni  model mrezne sigurnosti</w:t>
+      </w:r>
+    </w:p>
+    <w:p>
+      <w:pPr>
+        <w:pStyle w:val="TextBody"/>
+        <w:spacing w:lineRule="auto" w:line="360"/>
+        <w:rPr/>
+      </w:pPr>
+      <w:r>
+        <w:rPr/>
+        <w:t xml:space="preserve">Klasični model mrežne sigurnosti (vidi Sliku </w:t>
+      </w:r>
+      <w:r>
+        <w:rPr/>
+        <w:t>2</w:t>
+      </w:r>
+      <w:r>
+        <w:rPr/>
+        <w:t>) prvenstveno se oslanja na zaštitu granica ili pristupnih točaka mreže. Za pristup zaštićenoj mreži, entitet (bilo korisnik ili sustav) mora pružiti neki oblik autentifikacije. Nakon uspješne autentifikacije, entitetu je omogućeno kretanje kroz sva mrežna područja koja su mu dodijeljena, u skladu s unaprijed definiranom sigurnosnom politikom mreže.</w:t>
+      </w:r>
+    </w:p>
+    <w:p>
+      <w:pPr>
+        <w:pStyle w:val="TextBody"/>
+        <w:spacing w:lineRule="auto" w:line="360"/>
+        <w:rPr/>
+      </w:pPr>
+      <w:r>
+        <w:rPr/>
+        <w:t>Ovaj sigurnosni model može biti odgovarajući za zaštitu mreža koje ne sadrže osjetljive informacije. Međutim, većina organizacija danas pohranjuje različite vrste osjetljivih podataka, poput osobnih podataka korisnika, medicinske dokumentacije pacijenata, poslovnih tajni, poreznih evidencija i pravnih dokumenata, među ostalim.</w:t>
+      </w:r>
+    </w:p>
+    <w:p>
+      <w:pPr>
+        <w:pStyle w:val="Heading2"/>
+        <w:numPr>
+          <w:ilvl w:val="1"/>
+          <w:numId w:val="2"/>
+        </w:numPr>
+        <w:rPr/>
+      </w:pPr>
+      <w:bookmarkStart w:id="8" w:name="_Toc213706379"/>
+      <w:bookmarkEnd w:id="8"/>
+      <w:r>
+        <w:rPr/>
+        <w:t>Cloud i mikroservisi</w:t>
+      </w:r>
+    </w:p>
+    <w:p>
+      <w:pPr>
+        <w:pStyle w:val="Normal"/>
+        <w:rPr/>
+      </w:pPr>
+      <w:r>
+        <w:rPr/>
+        <w:t>Razvoj cloud računarstva i mikroservisnih arhitektura predstavlja jednu od ključnih promjena u modernim informacijskim sustavima, s izravnim utjecajem na sigurnosne modele i načine upravljanja aplikacijama. Cloud okruženja omogućuju isporuku računalnih resursa (poslužitelji, pohrana, baze podataka i aplikacijske usluge) putem interneta, uz visoku razinu skalabilnosti, fleksibilnosti i dostupnosti.</w:t>
+      </w:r>
+    </w:p>
+    <w:p>
+      <w:pPr>
+        <w:pStyle w:val="TextBody"/>
+        <w:spacing w:lineRule="auto" w:line="360"/>
+        <w:rPr/>
+      </w:pPr>
+      <w:r>
+        <w:rPr/>
+        <w:t>U takvom modelu resursi više nisu vezani uz fizičku infrastrukturu unutar organizacije, već se distribuiraju kroz različite pružatelje usluga i geografske lokacije. To uvodi dinamičnost u infrastrukturu, gdje se resursi mogu automatski skalirati, premještati i rekonfigurirati ovisno o opterećenju i poslovnim zahtjevima.</w:t>
+      </w:r>
+    </w:p>
+    <w:p>
+      <w:pPr>
+        <w:pStyle w:val="Normal"/>
+        <w:spacing w:lineRule="auto" w:line="360"/>
+        <w:rPr/>
+      </w:pPr>
+      <w:r>
+        <w:rPr/>
+        <w:drawing>
+          <wp:anchor behindDoc="0" distT="0" distB="0" distL="0" distR="0" simplePos="0" locked="0" layoutInCell="1" allowOverlap="1" relativeHeight="4">
+            <wp:simplePos x="0" y="0"/>
+            <wp:positionH relativeFrom="column">
+              <wp:posOffset>934720</wp:posOffset>
+            </wp:positionH>
+            <wp:positionV relativeFrom="paragraph">
+              <wp:posOffset>31115</wp:posOffset>
+            </wp:positionV>
+            <wp:extent cx="3677285" cy="3385820"/>
+            <wp:effectExtent l="0" t="0" r="0" b="0"/>
+            <wp:wrapNone/>
+            <wp:docPr id="5" name="Image1" descr=""/>
+            <wp:cNvGraphicFramePr>
+              <a:graphicFrameLocks xmlns:a="http://schemas.openxmlformats.org/drawingml/2006/main" noChangeAspect="1"/>
+            </wp:cNvGraphicFramePr>
+            <a:graphic xmlns:a="http://schemas.openxmlformats.org/drawingml/2006/main">
+              <a:graphicData uri="http://schemas.openxmlformats.org/drawingml/2006/picture">
+                <pic:pic xmlns:pic="http://schemas.openxmlformats.org/drawingml/2006/picture">
+                  <pic:nvPicPr>
+                    <pic:cNvPr id="5" name="Image1" descr=""/>
+                    <pic:cNvPicPr>
+                      <a:picLocks noChangeAspect="1" noChangeArrowheads="1"/>
+                    </pic:cNvPicPr>
+                  </pic:nvPicPr>
+                  <pic:blipFill>
+                    <a:blip r:embed="rId8"/>
+                    <a:stretch>
+                      <a:fillRect/>
+                    </a:stretch>
+                  </pic:blipFill>
+                  <pic:spPr bwMode="auto">
+                    <a:xfrm>
+                      <a:off x="0" y="0"/>
+                      <a:ext cx="3677285" cy="3385820"/>
+                    </a:xfrm>
+                    <a:prstGeom prst="rect">
+                      <a:avLst/>
+                    </a:prstGeom>
+                  </pic:spPr>
+                </pic:pic>
+              </a:graphicData>
+            </a:graphic>
+          </wp:anchor>
+        </w:drawing>
+      </w:r>
+    </w:p>
+    <w:p>
+      <w:pPr>
+        <w:pStyle w:val="Normal"/>
+        <w:rPr/>
+      </w:pPr>
+      <w:r>
+        <w:rPr/>
+      </w:r>
+    </w:p>
+    <w:p>
+      <w:pPr>
+        <w:pStyle w:val="Normal"/>
+        <w:rPr/>
+      </w:pPr>
+      <w:r>
+        <w:rPr/>
+      </w:r>
+    </w:p>
+    <w:p>
+      <w:pPr>
+        <w:pStyle w:val="Normal"/>
+        <w:rPr/>
+      </w:pPr>
+      <w:r>
+        <w:rPr/>
+      </w:r>
+    </w:p>
+    <w:p>
+      <w:pPr>
+        <w:pStyle w:val="Normal"/>
+        <w:rPr/>
+      </w:pPr>
+      <w:r>
+        <w:rPr/>
+      </w:r>
+    </w:p>
+    <w:p>
+      <w:pPr>
+        <w:pStyle w:val="Normal"/>
+        <w:rPr/>
+      </w:pPr>
+      <w:r>
+        <w:rPr/>
+      </w:r>
+    </w:p>
+    <w:p>
+      <w:pPr>
+        <w:pStyle w:val="Normal"/>
+        <w:rPr/>
+      </w:pPr>
+      <w:r>
+        <w:rPr/>
+      </w:r>
+    </w:p>
+    <w:p>
+      <w:pPr>
+        <w:pStyle w:val="Normal"/>
+        <w:rPr/>
+      </w:pPr>
+      <w:r>
+        <w:rPr/>
+      </w:r>
+    </w:p>
+    <w:p>
+      <w:pPr>
+        <w:pStyle w:val="Slika"/>
+        <w:rPr/>
+      </w:pPr>
+      <w:r>
+        <w:rPr>
+          <w:b/>
+          <w:bCs/>
+        </w:rPr>
         <w:t>Slika 3</w:t>
       </w:r>
       <w:r>
         <w:rPr/>
-        <w:t>: Naziv slike</w:t>
-      </w:r>
-    </w:p>
-    <w:p>
-      <w:pPr>
-        <w:pStyle w:val="Normal"/>
-        <w:rPr/>
-      </w:pPr>
-      <w:r>
-        <w:rPr/>
-        <w:t>Lorem ipsum dolor sit amet consectetur adipiscing elit. Quisque faucibus ex sapien vitae pellentesque sem placerat. In id cursus mi pretium tellus duis convallis. Tempus leo eu aenean sed diam urna tempor. Pulvinar vivamus fringilla lacus nec metus bibendum egestas. Iaculis massa nisl malesuada lacinia integer nunc posuere. Ut hendrerit semper vel class aptent taciti sociosqu. Ad litora torquent per conubia nostra inceptos himenaeos.</w:t>
+        <w:t xml:space="preserve">: </w:t>
+      </w:r>
+      <w:r>
+        <w:rPr/>
+        <w:t>Arhitektura cloud okruženja</w:t>
+      </w:r>
+    </w:p>
+    <w:p>
+      <w:pPr>
+        <w:pStyle w:val="Normal"/>
+        <w:rPr/>
+      </w:pPr>
+      <w:r>
+        <w:rPr/>
+        <w:t>Paralelno s razvojem clouda, sve veću primjenu imaju mikroservisne arhitekture, koje aplikacije razlažu na skup manjih, neovisnih servisa. Svaki mikroservis obavlja specifičnu funkcionalnost i komunicira s drugim servisima putem mrežnih protokola, najčešće REST ili gRPC sučelja. Ovakav pristup omogućuje veću modularnost, lakše održavanje i neovisno skaliranje pojedinih komponenti sustava.</w:t>
+      </w:r>
+    </w:p>
+    <w:p>
+      <w:pPr>
+        <w:pStyle w:val="Slika"/>
+        <w:rPr/>
+      </w:pPr>
+      <w:r>
+        <w:rPr/>
+        <w:drawing>
+          <wp:anchor behindDoc="0" distT="0" distB="0" distL="0" distR="0" simplePos="0" locked="0" layoutInCell="1" allowOverlap="1" relativeHeight="7">
+            <wp:simplePos x="0" y="0"/>
+            <wp:positionH relativeFrom="column">
+              <wp:align>center</wp:align>
+            </wp:positionH>
+            <wp:positionV relativeFrom="paragraph">
+              <wp:posOffset>635</wp:posOffset>
+            </wp:positionV>
+            <wp:extent cx="5158105" cy="2805430"/>
+            <wp:effectExtent l="0" t="0" r="0" b="0"/>
+            <wp:wrapSquare wrapText="largest"/>
+            <wp:docPr id="6" name="Image2" descr=""/>
+            <wp:cNvGraphicFramePr>
+              <a:graphicFrameLocks xmlns:a="http://schemas.openxmlformats.org/drawingml/2006/main" noChangeAspect="1"/>
+            </wp:cNvGraphicFramePr>
+            <a:graphic xmlns:a="http://schemas.openxmlformats.org/drawingml/2006/main">
+              <a:graphicData uri="http://schemas.openxmlformats.org/drawingml/2006/picture">
+                <pic:pic xmlns:pic="http://schemas.openxmlformats.org/drawingml/2006/picture">
+                  <pic:nvPicPr>
+                    <pic:cNvPr id="6" name="Image2" descr=""/>
+                    <pic:cNvPicPr>
+                      <a:picLocks noChangeAspect="1" noChangeArrowheads="1"/>
+                    </pic:cNvPicPr>
+                  </pic:nvPicPr>
+                  <pic:blipFill>
+                    <a:blip r:embed="rId9"/>
+                    <a:stretch>
+                      <a:fillRect/>
+                    </a:stretch>
+                  </pic:blipFill>
+                  <pic:spPr bwMode="auto">
+                    <a:xfrm>
+                      <a:off x="0" y="0"/>
+                      <a:ext cx="5158105" cy="2805430"/>
+                    </a:xfrm>
+                    <a:prstGeom prst="rect">
+                      <a:avLst/>
+                    </a:prstGeom>
+                  </pic:spPr>
+                </pic:pic>
+              </a:graphicData>
+            </a:graphic>
+          </wp:anchor>
+        </w:drawing>
+      </w:r>
+    </w:p>
+    <w:p>
+      <w:pPr>
+        <w:pStyle w:val="Slika"/>
+        <w:rPr/>
+      </w:pPr>
+      <w:r>
+        <w:rPr>
+          <w:b/>
+          <w:bCs/>
+        </w:rPr>
+        <w:t xml:space="preserve">Slika </w:t>
+      </w:r>
+      <w:r>
+        <w:rPr>
+          <w:b/>
+          <w:bCs/>
+        </w:rPr>
+        <w:t>4</w:t>
+      </w:r>
+      <w:r>
+        <w:rPr/>
+        <w:t xml:space="preserve">: </w:t>
+      </w:r>
+      <w:r>
+        <w:rPr/>
+        <w:t>Mikroservisna arhitektura</w:t>
+      </w:r>
+    </w:p>
+    <w:p>
+      <w:pPr>
+        <w:pStyle w:val="Normal"/>
+        <w:rPr/>
+      </w:pPr>
+      <w:r>
+        <w:rPr/>
+        <w:t>Microservi</w:t>
+      </w:r>
+      <w:r>
+        <w:rPr/>
+        <w:t>sna</w:t>
+      </w:r>
+      <w:r>
+        <w:rPr/>
+        <w:t xml:space="preserve"> </w:t>
+      </w:r>
+      <w:r>
+        <w:rPr/>
+        <w:t>arhitektura</w:t>
+      </w:r>
+      <w:r>
+        <w:rPr/>
+        <w:t xml:space="preserve"> donosi značajne prednosti u pogledu agilnosti razvoja i otpornosti sustava, ali istovremeno povećava kompleksnost mrežne komunikacije i sigurnosnog upravljanja. Za razliku od monolitne arhitekture, gdje je cjelokupna aplikacijska logika implementirana unutar jedinstvenog sustava i izvršava se kao jedna cjelina, mikroservisna arhitektura razdvaja funkcionalnosti u više neovisnih servisa koji komuniciraju putem mreže. Monolitni pristup pojednostavljuje upravljanje sigurnošću jer se komunikacija odvija unutar istog procesa ili kontroliranog okruženja, dok mikroservisna arhitektura uvodi distribuiranu komunikaciju koja zahtijeva dodatne mehanizme zaštite, autentifikacije i nadzora.</w:t>
+      </w:r>
+    </w:p>
+    <w:p>
+      <w:pPr>
+        <w:pStyle w:val="Heading3"/>
+        <w:numPr>
+          <w:ilvl w:val="0"/>
+          <w:numId w:val="0"/>
+        </w:numPr>
+        <w:ind w:left="907" w:hanging="0"/>
+        <w:rPr/>
+      </w:pPr>
+      <w:r>
+        <w:rPr/>
+      </w:r>
+    </w:p>
+    <w:p>
+      <w:pPr>
+        <w:pStyle w:val="Heading3"/>
+        <w:numPr>
+          <w:ilvl w:val="0"/>
+          <w:numId w:val="0"/>
+        </w:numPr>
+        <w:ind w:left="907" w:hanging="0"/>
+        <w:rPr/>
+      </w:pPr>
+      <w:r>
+        <w:rPr/>
+      </w:r>
+    </w:p>
+    <w:p>
+      <w:pPr>
+        <w:pStyle w:val="Normal"/>
+        <w:ind w:hanging="0"/>
+        <w:rPr/>
+      </w:pPr>
+      <w:r>
+        <w:rPr/>
+      </w:r>
+    </w:p>
+    <w:p>
+      <w:pPr>
+        <w:pStyle w:val="Normal"/>
+        <w:ind w:hanging="0"/>
+        <w:rPr/>
+      </w:pPr>
+      <w:r>
+        <w:rPr/>
+      </w:r>
+    </w:p>
+    <w:p>
+      <w:pPr>
+        <w:pStyle w:val="Normal"/>
+        <w:rPr/>
+      </w:pPr>
+      <w:r>
+        <w:rPr/>
+      </w:r>
+    </w:p>
+    <w:p>
+      <w:pPr>
+        <w:pStyle w:val="Heading2"/>
+        <w:numPr>
+          <w:ilvl w:val="1"/>
+          <w:numId w:val="2"/>
+        </w:numPr>
+        <w:rPr/>
+      </w:pPr>
+      <w:bookmarkStart w:id="9" w:name="_Toc213706382"/>
+      <w:r>
+        <w:rPr/>
+        <w:t>L</w:t>
+      </w:r>
+      <w:bookmarkEnd w:id="9"/>
+      <w:r>
+        <w:rPr/>
+        <w:t>ateralno kretanje napadača</w:t>
+      </w:r>
+    </w:p>
+    <w:p>
+      <w:pPr>
+        <w:pStyle w:val="TextBody"/>
+        <w:spacing w:lineRule="auto" w:line="360"/>
+        <w:rPr/>
+      </w:pPr>
+      <w:r>
+        <w:rPr/>
+        <w:t>Lateralno kretanje predstavlja tehniku koju napadači koriste nakon početnog kompromitiranja sustava, s ciljem širenja pristupa unutar mrežnog okruženja.</w:t>
+      </w:r>
+    </w:p>
+    <w:p>
+      <w:pPr>
+        <w:pStyle w:val="TextBody"/>
+        <w:spacing w:lineRule="auto" w:line="360"/>
+        <w:rPr/>
+      </w:pPr>
+      <w:r>
+        <w:rPr/>
+        <w:t xml:space="preserve">Ovaj proces </w:t>
+      </w:r>
+      <w:r>
+        <w:rPr/>
+        <w:t xml:space="preserve">se </w:t>
+      </w:r>
+      <w:r>
+        <w:rPr/>
+        <w:t>obično odvija kroz tri osnovne faze: izviđanje (reconnaissance, prikupljanje vjerodajnica i eskalaciju privilegija te konačno ostvarivanje pristupa dodatnim računalima unutar mreže.</w:t>
       </w:r>
     </w:p>
     <w:p>
@@ -3887,23 +4427,31 @@
           <w:ilvl w:val="2"/>
           <w:numId w:val="2"/>
         </w:numPr>
-        <w:rPr/>
-      </w:pPr>
-      <w:bookmarkStart w:id="11" w:name="_Toc213706380"/>
-      <w:r>
-        <w:rPr/>
-        <w:t>Podpoglavlje</w:t>
-      </w:r>
-      <w:bookmarkEnd w:id="11"/>
-    </w:p>
-    <w:p>
-      <w:pPr>
-        <w:pStyle w:val="Normal"/>
-        <w:rPr/>
-      </w:pPr>
-      <w:r>
-        <w:rPr/>
-        <w:t>Lorem ipsum dolor sit amet consectetur adipiscing elit. Quisque faucibus ex sapien vitae pellentesque sem placerat. In id cursus mi pretium tellus duis convallis. Tempus leo eu aenean sed diam urna tempor. Pulvinar vivamus fringilla lacus nec metus bibendum egestas. Iaculis massa nisl malesuada lacinia integer nunc posuere. Ut hendrerit semper vel class aptent taciti sociosqu. Ad litora torquent per conubia nostra inceptos himenaeos.</w:t>
+        <w:spacing w:lineRule="auto" w:line="360"/>
+        <w:rPr/>
+      </w:pPr>
+      <w:r>
+        <w:rPr/>
+        <w:t>Izviđanje</w:t>
+      </w:r>
+    </w:p>
+    <w:p>
+      <w:pPr>
+        <w:pStyle w:val="Normal"/>
+        <w:spacing w:lineRule="auto" w:line="360"/>
+        <w:rPr/>
+      </w:pPr>
+      <w:r>
+        <w:rPr/>
+        <w:t xml:space="preserve">U fazi izviđanja napadač analizira mrežno okruženje kako bi prikupio informacije o strukturama sustava, korisnicima i uređajima. Cilj ove faze je razumijevanje topologije mreže, identifikacija kritičnih resursa te prikupljanje tehničkih informacija poput mrežnih konfiguracija, aktivnih veza i dostupnih sustava. U ovoj fazi često se koriste i ugrađeni alati operacijskog sustava, poput mrežnih dijagnostičkih naredbi i administrativnih alata </w:t>
+      </w:r>
+      <w:r>
+        <w:rPr/>
+        <w:t>(kao Netstat, IPConfig/IFConfig, PowerShell)</w:t>
+      </w:r>
+      <w:r>
+        <w:rPr/>
+        <w:t>, kako bi se izbjegla detekcija.</w:t>
       </w:r>
     </w:p>
     <w:p>
@@ -3913,32 +4461,60 @@
           <w:ilvl w:val="2"/>
           <w:numId w:val="2"/>
         </w:numPr>
-        <w:rPr/>
-      </w:pPr>
-      <w:bookmarkStart w:id="12" w:name="_Toc213706381"/>
-      <w:r>
-        <w:rPr/>
-        <w:t>Podpoglavlje</w:t>
-      </w:r>
-      <w:bookmarkEnd w:id="12"/>
-    </w:p>
-    <w:p>
-      <w:pPr>
-        <w:pStyle w:val="Normal"/>
-        <w:rPr/>
-      </w:pPr>
-      <w:r>
-        <w:rPr/>
-        <w:t>Lorem ipsum dolor sit amet consectetur adipiscing elit. Quisque faucibus ex sapien vitae pellentesque sem placerat. In id cursus mi pretium tellus duis convallis. Tempus leo eu aenean sed diam urna tempor. Pulvinar vivamus fringilla lacus nec metus bibendum egestas. Iaculis massa nisl malesuada lacinia integer nunc posuere. Ut hendrerit semper vel class aptent taciti sociosqu. Ad litora torquent per conubia nostra inceptos himenaeos.</w:t>
-      </w:r>
-    </w:p>
-    <w:p>
-      <w:pPr>
-        <w:pStyle w:val="Normal"/>
-        <w:rPr/>
-      </w:pPr>
-      <w:r>
-        <w:rPr/>
+        <w:spacing w:lineRule="auto" w:line="360"/>
+        <w:rPr/>
+      </w:pPr>
+      <w:r>
+        <w:rPr/>
+        <w:t>Prikupljanje vjerodajnica i eskalacija privilegija</w:t>
+      </w:r>
+    </w:p>
+    <w:p>
+      <w:pPr>
+        <w:pStyle w:val="Normal"/>
+        <w:spacing w:lineRule="auto" w:line="360"/>
+        <w:rPr/>
+      </w:pPr>
+      <w:r>
+        <w:rPr/>
+        <w:t>Napadači nastoje doći do valjanih korisničkih podataka kako bi se autentificirali kao legitimni korisnici sustava. To se može postići različitim tehnikama, uključujući socijalni inženjering, krađu hashiranih lozinki, zlouporabu autentifikacijskih tokena te kompromitaciju memorije sustava. Nakon dobivanja vjerodajnica, napadač može eskalirati privilegije i proširiti svoj pristup unutar mreže.</w:t>
+      </w:r>
+    </w:p>
+    <w:p>
+      <w:pPr>
+        <w:pStyle w:val="Heading3"/>
+        <w:numPr>
+          <w:ilvl w:val="2"/>
+          <w:numId w:val="2"/>
+        </w:numPr>
+        <w:spacing w:lineRule="auto" w:line="360"/>
+        <w:rPr/>
+      </w:pPr>
+      <w:r>
+        <w:rPr/>
+        <w:t>Eskalacija privilegija</w:t>
+      </w:r>
+    </w:p>
+    <w:p>
+      <w:pPr>
+        <w:pStyle w:val="Normal"/>
+        <w:spacing w:lineRule="auto" w:line="360"/>
+        <w:rPr/>
+      </w:pPr>
+      <w:r>
+        <w:rPr/>
+        <w:t>U završnoj fazi napadač koristi dobivene pristupne podatke za kretanje kroz mrežu i kompromitaciju dodatnih sustava, sve dok ne dođe do željenih podataka ili kritičnih resursa. Ovakvo ponašanje često je teško detektirati jer se može maskirati kao legitimna mrežna aktivnost, posebno kada se koriste ugrađeni administrativni alati i valjane korisničke sesije.</w:t>
+      </w:r>
+    </w:p>
+    <w:p>
+      <w:pPr>
+        <w:pStyle w:val="TextBody"/>
+        <w:spacing w:lineRule="auto" w:line="360"/>
+        <w:rPr/>
+      </w:pPr>
+      <w:r>
+        <w:rPr/>
+        <w:t>Zbog sve veće kompleksnosti modernih mreža i korištenja distribuiranih sustava, lateralno kretanje predstavlja jednu od ključnih faza u razvoju kibernetičkog napada te značajan izazov za sigurnosne mehanizme.</w:t>
       </w:r>
     </w:p>
     <w:p>
@@ -3950,143 +4526,16 @@
         </w:numPr>
         <w:rPr/>
       </w:pPr>
-      <w:bookmarkStart w:id="13" w:name="_Toc213706382"/>
-      <w:r>
-        <w:rPr/>
-        <w:t>Podpoglavlje</w:t>
-      </w:r>
-      <w:bookmarkEnd w:id="13"/>
-    </w:p>
-    <w:p>
-      <w:pPr>
-        <w:pStyle w:val="Normal"/>
-        <w:rPr/>
-      </w:pPr>
-      <w:r>
-        <w:rPr/>
-        <w:t xml:space="preserve">Lorem ipsum dolor sit amet consectetur adipiscing elit. Quisque faucibus ex sapien vitae pellentesque sem placerat. In id cursus mi pretium tellus duis convallis. Tempus leo eu aenean sed diam urna tempor. Pulvinar </w:t>
-      </w:r>
-      <w:r>
-        <w:rPr>
-          <w:rStyle w:val="VarijableChar"/>
-        </w:rPr>
-        <w:t>vivamus</w:t>
-      </w:r>
-      <w:r>
-        <w:rPr/>
-        <w:t xml:space="preserve"> fringilla lacus nec metus bibendum egestas. Iaculis massa nisl malesuada lacinia integer nunc posuere. Ut </w:t>
-      </w:r>
-      <w:r>
-        <w:rPr>
-          <w:rStyle w:val="VarijableChar"/>
-        </w:rPr>
-        <w:t>hendrerit</w:t>
-      </w:r>
-      <w:r>
-        <w:rPr/>
-        <w:t xml:space="preserve"> semper vel class aptent taciti sociosqu. Ad litora torquent per conubia nostra inceptos himenaeos, ispis 1.</w:t>
-      </w:r>
-    </w:p>
-    <w:p>
-      <w:pPr>
-        <w:pStyle w:val="Ispiskoda"/>
-        <w:rPr/>
-      </w:pPr>
-      <w:r>
-        <w:rPr/>
-        <w:t>main( ) {</w:t>
-      </w:r>
-    </w:p>
-    <w:p>
-      <w:pPr>
-        <w:pStyle w:val="Ispiskoda"/>
-        <w:rPr/>
-      </w:pPr>
-      <w:r>
-        <w:rPr/>
-        <w:t xml:space="preserve">        </w:t>
-      </w:r>
-      <w:r>
-        <w:rPr/>
-        <w:t>printf("hello, world");</w:t>
-      </w:r>
-    </w:p>
-    <w:p>
-      <w:pPr>
-        <w:pStyle w:val="Ispiskoda"/>
-        <w:rPr/>
-      </w:pPr>
-      <w:r>
-        <w:rPr/>
-        <w:t>}</w:t>
-      </w:r>
-    </w:p>
-    <w:p>
-      <w:pPr>
-        <w:pStyle w:val="Ispiscaption"/>
-        <w:rPr>
-          <w:b w:val="false"/>
-          <w:b w:val="false"/>
-          <w:bCs/>
-        </w:rPr>
-      </w:pPr>
-      <w:r>
-        <w:rPr/>
-        <w:t>Ispis 1</w:t>
-      </w:r>
-      <w:r>
-        <w:rPr>
-          <w:b w:val="false"/>
-          <w:bCs/>
-        </w:rPr>
-        <w:t>: Naziv koda</w:t>
-      </w:r>
-    </w:p>
-    <w:p>
-      <w:pPr>
-        <w:pStyle w:val="Normal"/>
-        <w:rPr/>
-      </w:pPr>
-      <w:r>
-        <w:rPr/>
-        <w:t>Lorem ipsum dolor sit amet consectetur adipiscing elit. Quisque faucibus ex sapien vitae pellentesque sem placerat. In id cursus mi pretium tellus duis convallis. Tempus leo eu aenean sed diam urna tempor. Pulvinar vivamus fringilla lacus nec metus bibendum egestas. Iaculis massa nisl malesuada lacinia integer nunc posuere. Ut hendrerit semper vel class aptent taciti sociosqu. Ad litora torquent per conubia nostra inceptos himenaeos.</w:t>
-      </w:r>
-    </w:p>
-    <w:p>
-      <w:pPr>
-        <w:pStyle w:val="Normal"/>
-        <w:rPr/>
-      </w:pPr>
-      <w:r>
-        <w:rPr/>
-        <w:t>Lorem ipsum dolor sit amet consectetur adipiscing elit. Quisque faucibus ex sapien vitae pellentesque sem placerat. In id cursus mi pretium tellus duis convallis. Tempus leo eu aenean sed diam urna tempor. Pulvinar vivamus fringilla lacus nec metus bibendum egestas. Iaculis massa nisl malesuada lacinia integer nunc posuere. Ut hendrerit semper vel class aptent taciti sociosqu. Ad litora torquent per conubia nostra inceptos himenaeos.</w:t>
-      </w:r>
-    </w:p>
-    <w:p>
-      <w:pPr>
-        <w:pStyle w:val="Normal"/>
-        <w:rPr/>
-      </w:pPr>
-      <w:r>
-        <w:rPr/>
-        <w:t>Lorem ipsum dolor sit amet consectetur adipiscing elit. Quisque faucibus ex sapien vitae pellentesque sem placerat. In id cursus mi pretium tellus duis convallis. Tempus leo eu aenean sed diam urna tempor. Pulvinar vivamus fringilla lacus nec metus bibendum egestas. Iaculis massa nisl malesuada lacinia integer nunc posuere. Ut hendrerit semper vel class aptent taciti sociosqu. Ad litora torquent per conubia nostra inceptos himenaeos.</w:t>
-      </w:r>
-    </w:p>
-    <w:p>
-      <w:pPr>
-        <w:pStyle w:val="Heading2"/>
-        <w:numPr>
-          <w:ilvl w:val="1"/>
-          <w:numId w:val="2"/>
-        </w:numPr>
-        <w:rPr/>
-      </w:pPr>
-      <w:bookmarkStart w:id="14" w:name="_Toc213706383"/>
-      <w:r>
-        <w:rPr/>
-        <w:t>Podpoglavlje</w:t>
-      </w:r>
-      <w:bookmarkEnd w:id="14"/>
+      <w:bookmarkStart w:id="10" w:name="_Toc213706383"/>
+      <w:bookmarkEnd w:id="10"/>
+      <w:r>
+        <w:rPr/>
+        <w:t>N</w:t>
+      </w:r>
+      <w:r>
+        <w:rPr/>
+        <w:t>astanak Zero Trust modela</w:t>
+      </w:r>
     </w:p>
     <w:p>
       <w:pPr>
@@ -4436,85 +4885,6 @@
         <w:rPr/>
         <w:t>Lorem ipsum dolor sit amet consectetur adipiscing elit. Quisque faucibus ex sapien vitae pellentesque sem placerat. In id cursus mi pretium tellus duis convallis. Tempus leo eu aenean sed diam urna tempor. Pulvinar vivamus fringilla lacus nec metus bibendum egestas. Iaculis massa nisl malesuada lacinia integer nunc posuere. Ut hendrerit semper vel class aptent taciti sociosqu. Ad litora torquent per conubia nostra inceptos himenaeos.</w:t>
       </w:r>
-    </w:p>
-    <w:p>
-      <w:pPr>
-        <w:pStyle w:val="Heading2"/>
-        <w:numPr>
-          <w:ilvl w:val="1"/>
-          <w:numId w:val="2"/>
-        </w:numPr>
-        <w:rPr/>
-      </w:pPr>
-      <w:bookmarkStart w:id="15" w:name="_Toc213706384"/>
-      <w:r>
-        <w:rPr/>
-        <w:t>Podpoglavlje</w:t>
-      </w:r>
-      <w:bookmarkEnd w:id="15"/>
-    </w:p>
-    <w:p>
-      <w:pPr>
-        <w:pStyle w:val="Normal"/>
-        <w:rPr/>
-      </w:pPr>
-      <w:r>
-        <w:rPr/>
-        <w:t>Lorem ipsum dolor sit amet consectetur adipiscing elit. Quisque faucibus ex sapien vitae pellentesque sem placerat. In id cursus mi pretium tellus duis convallis. Tempus leo eu aenean sed diam urna tempor. Pulvinar vivamus fringilla lacus nec metus bibendum egestas. Iaculis massa nisl malesuada lacinia integer nunc posuere. Ut hendrerit semper vel class aptent taciti sociosqu. Ad litora torquent per conubia nostra inceptos himenaeos.</w:t>
-      </w:r>
-    </w:p>
-    <w:p>
-      <w:pPr>
-        <w:pStyle w:val="Normal"/>
-        <w:rPr/>
-      </w:pPr>
-      <w:r>
-        <w:rPr/>
-        <w:t>Lorem ipsum dolor sit amet consectetur adipiscing elit. Quisque faucibus ex sapien vitae pellentesque sem placerat. In id cursus mi pretium tellus duis convallis. Tempus leo eu aenean sed diam urna tempor. Pulvinar vivamus fringilla lacus nec metus bibendum egestas. Iaculis massa nisl malesuada lacinia integer nunc posuere. Ut hendrerit semper vel class aptent taciti sociosqu. Ad litora torquent per conubia nostra inceptos himenaeos.</w:t>
-      </w:r>
-    </w:p>
-    <w:p>
-      <w:pPr>
-        <w:pStyle w:val="Normal"/>
-        <w:rPr/>
-      </w:pPr>
-      <w:r>
-        <w:rPr/>
-        <w:t>Lorem ipsum dolor sit amet consectetur adipiscing elit. Quisque faucibus ex sapien vitae pellentesque sem placerat. In id cursus mi pretium tellus duis convallis. Tempus leo eu aenean sed diam urna tempor. Pulvinar vivamus fringilla lacus nec metus bibendum egestas. Iaculis massa nisl malesuada lacinia integer nunc posuere. Ut hendrerit semper vel class aptent taciti sociosqu. Ad litora torquent per conubia nostra inceptos himenaeos.</w:t>
-      </w:r>
-    </w:p>
-    <w:p>
-      <w:pPr>
-        <w:pStyle w:val="Normal"/>
-        <w:rPr/>
-      </w:pPr>
-      <w:r>
-        <w:rPr/>
-        <w:t>Lorem ipsum dolor sit amet consectetur adipiscing elit. Quisque faucibus ex sapien vitae pellentesque sem placerat. In id cursus mi pretium tellus duis convallis. Tempus leo eu aenean sed diam urna tempor. Pulvinar vivamus fringilla lacus nec metus bibendum egestas. Iaculis massa nisl malesuada lacinia integer nunc posuere. Ut hendrerit semper vel class aptent taciti sociosqu. Ad litora torquent per conubia nostra inceptos himenaeos.</w:t>
-      </w:r>
-    </w:p>
-    <w:p>
-      <w:pPr>
-        <w:pStyle w:val="Normal"/>
-        <w:spacing w:lineRule="auto" w:line="259" w:before="0" w:after="160"/>
-        <w:ind w:hanging="0"/>
-        <w:jc w:val="left"/>
-        <w:rPr>
-          <w:rFonts w:ascii="Arial" w:hAnsi="Arial" w:eastAsia="等线 Light" w:cs="Times New Roman" w:cstheme="majorBidi" w:eastAsiaTheme="majorEastAsia"/>
-          <w:b/>
-          <w:b/>
-          <w:sz w:val="36"/>
-          <w:szCs w:val="40"/>
-        </w:rPr>
-      </w:pPr>
-      <w:r>
-        <w:rPr>
-          <w:rFonts w:eastAsia="等线 Light" w:cs="Times New Roman" w:cstheme="majorBidi" w:eastAsiaTheme="majorEastAsia" w:ascii="Arial" w:hAnsi="Arial"/>
-          <w:b/>
-          <w:sz w:val="36"/>
-          <w:szCs w:val="40"/>
-        </w:rPr>
-      </w:r>
       <w:r>
         <w:br w:type="page"/>
       </w:r>
@@ -4529,12 +4899,16 @@
         <w:spacing w:before="480" w:after="280"/>
         <w:rPr/>
       </w:pPr>
-      <w:bookmarkStart w:id="16" w:name="_Toc213706385"/>
-      <w:r>
-        <w:rPr/>
-        <w:t>Još jedan dio o praktičnom radu</w:t>
-      </w:r>
-      <w:bookmarkEnd w:id="16"/>
+      <w:bookmarkStart w:id="11" w:name="_Toc213706385"/>
+      <w:r>
+        <w:rPr/>
+        <w:t>K</w:t>
+      </w:r>
+      <w:bookmarkEnd w:id="11"/>
+      <w:r>
+        <w:rPr/>
+        <w:t>ubernetes</w:t>
+      </w:r>
     </w:p>
     <w:p>
       <w:pPr>
@@ -4575,12 +4949,16 @@
         </w:numPr>
         <w:rPr/>
       </w:pPr>
-      <w:bookmarkStart w:id="17" w:name="_Toc213706386"/>
-      <w:r>
-        <w:rPr/>
-        <w:t>Podpoglavlje</w:t>
-      </w:r>
-      <w:bookmarkEnd w:id="17"/>
+      <w:bookmarkStart w:id="12" w:name="_Toc213706386"/>
+      <w:r>
+        <w:rPr/>
+        <w:t>O</w:t>
+      </w:r>
+      <w:bookmarkEnd w:id="12"/>
+      <w:r>
+        <w:rPr/>
+        <w:t>snove Kubernetes arhitekture</w:t>
+      </w:r>
     </w:p>
     <w:p>
       <w:pPr>
@@ -4651,12 +5029,16 @@
         </w:numPr>
         <w:rPr/>
       </w:pPr>
-      <w:bookmarkStart w:id="18" w:name="_Toc213706387"/>
-      <w:r>
-        <w:rPr/>
-        <w:t>Podpoglavlje</w:t>
-      </w:r>
-      <w:bookmarkEnd w:id="18"/>
+      <w:bookmarkStart w:id="13" w:name="_Toc213706387"/>
+      <w:r>
+        <w:rPr/>
+        <w:t>S</w:t>
+      </w:r>
+      <w:bookmarkEnd w:id="13"/>
+      <w:r>
+        <w:rPr/>
+        <w:t>igurnosni izazovi</w:t>
+      </w:r>
     </w:p>
     <w:p>
       <w:pPr>
@@ -4697,63 +5079,1187 @@
         </w:numPr>
         <w:rPr/>
       </w:pPr>
-      <w:bookmarkStart w:id="19" w:name="_Toc213706388"/>
-      <w:r>
-        <w:rPr/>
-        <w:t>Podpoglavlje</w:t>
-      </w:r>
-      <w:bookmarkEnd w:id="19"/>
-    </w:p>
-    <w:p>
-      <w:pPr>
-        <w:pStyle w:val="Normal"/>
-        <w:rPr/>
-      </w:pPr>
-      <w:r>
-        <w:rPr/>
-        <w:t>Lorem ipsum dolor sit amet consectetur adipiscing elit. Quisque faucibus ex sapien vitae pellentesque sem placerat. In id cursus mi pretium tellus duis convallis. Tempus leo eu aenean sed diam urna tempor. Pulvinar vivamus fringilla lacus nec metus bibendum egestas. Iaculis massa nisl malesuada lacinia integer nunc posuere. Ut hendrerit semper vel class aptent taciti sociosqu. Ad litora torquent per conubia nostra inceptos himenaeos.</w:t>
-      </w:r>
-    </w:p>
-    <w:p>
-      <w:pPr>
-        <w:pStyle w:val="Normal"/>
-        <w:rPr/>
-      </w:pPr>
-      <w:r>
-        <w:rPr/>
-        <w:t>Lorem ipsum dolor sit amet consectetur adipiscing elit. Quisque faucibus ex sapien vitae pellentesque sem placerat. In id cursus mi pretium tellus duis convallis. Tempus leo eu aenean sed diam urna tempor. Pulvinar vivamus fringilla lacus nec metus bibendum egestas. Iaculis massa nisl malesuada lacinia integer nunc posuere. Ut hendrerit semper vel class aptent taciti sociosqu. Ad litora torquent per conubia nostra inceptos himenaeos.</w:t>
-      </w:r>
-    </w:p>
-    <w:p>
-      <w:pPr>
-        <w:pStyle w:val="Normal"/>
-        <w:rPr/>
-      </w:pPr>
-      <w:r>
-        <w:rPr/>
-        <w:t>Lorem ipsum dolor sit amet consectetur adipiscing elit. Quisque faucibus ex sapien vitae pellentesque sem placerat. In id cursus mi pretium tellus duis convallis. Tempus leo eu aenean sed diam urna tempor. Pulvinar vivamus fringilla lacus nec metus bibendum egestas. Iaculis massa nisl malesuada lacinia integer nunc posuere. Ut hendrerit semper vel class aptent taciti sociosqu. Ad litora torquent per conubia nostra inceptos himenaeos.</w:t>
-      </w:r>
-    </w:p>
-    <w:p>
-      <w:pPr>
-        <w:pStyle w:val="Normal"/>
-        <w:rPr/>
-      </w:pPr>
-      <w:r>
-        <w:rPr/>
-        <w:t>Lorem ipsum dolor sit amet consectetur adipiscing elit. Quisque faucibus ex sapien vitae pellentesque sem placerat. In id cursus mi pretium tellus duis convallis. Tempus leo eu aenean sed diam urna tempor. Pulvinar vivamus fringilla lacus nec metus bibendum egestas. Iaculis massa nisl malesuada lacinia integer nunc posuere. Ut hendrerit semper vel class aptent taciti sociosqu. Ad litora torquent per conubia nostra inceptos himenaeos.</w:t>
-      </w:r>
-    </w:p>
-    <w:p>
-      <w:pPr>
-        <w:pStyle w:val="Normal"/>
+      <w:bookmarkStart w:id="14" w:name="_Toc213706388"/>
+      <w:r>
+        <w:rPr/>
+        <w:t>S</w:t>
+      </w:r>
+      <w:bookmarkEnd w:id="14"/>
+      <w:r>
+        <w:rPr/>
+        <w:t>igurnosni mehanizmi</w:t>
+      </w:r>
+    </w:p>
+    <w:p>
+      <w:pPr>
+        <w:pStyle w:val="Heading2"/>
+        <w:numPr>
+          <w:ilvl w:val="1"/>
+          <w:numId w:val="2"/>
+        </w:numPr>
         <w:spacing w:lineRule="auto" w:line="259" w:before="0" w:after="160"/>
         <w:ind w:hanging="0"/>
         <w:jc w:val="left"/>
         <w:rPr/>
       </w:pPr>
-      <w:r>
-        <w:rPr/>
+      <w:bookmarkStart w:id="15" w:name="_Toc2137063881"/>
+      <w:r>
+        <w:rPr/>
+        <w:t>P</w:t>
+      </w:r>
+      <w:bookmarkEnd w:id="15"/>
+      <w:r>
+        <w:rPr/>
+        <w:t>ogodnost za Zero Trust</w:t>
+      </w:r>
+    </w:p>
+    <w:p>
+      <w:pPr>
+        <w:pStyle w:val="Normal"/>
+        <w:spacing w:lineRule="auto" w:line="259" w:before="0" w:after="160"/>
+        <w:ind w:hanging="0"/>
+        <w:jc w:val="left"/>
+        <w:rPr/>
+      </w:pPr>
+      <w:r>
+        <w:rPr/>
+      </w:r>
+    </w:p>
+    <w:p>
+      <w:pPr>
+        <w:pStyle w:val="Normal"/>
+        <w:spacing w:lineRule="auto" w:line="259" w:before="0" w:after="160"/>
+        <w:ind w:hanging="0"/>
+        <w:jc w:val="left"/>
+        <w:rPr/>
+      </w:pPr>
+      <w:r>
+        <w:rPr/>
+      </w:r>
+    </w:p>
+    <w:p>
+      <w:pPr>
+        <w:pStyle w:val="Normal"/>
+        <w:spacing w:lineRule="auto" w:line="259" w:before="0" w:after="160"/>
+        <w:ind w:hanging="0"/>
+        <w:jc w:val="left"/>
+        <w:rPr/>
+      </w:pPr>
+      <w:r>
+        <w:rPr/>
+      </w:r>
+    </w:p>
+    <w:p>
+      <w:pPr>
+        <w:pStyle w:val="Normal"/>
+        <w:spacing w:lineRule="auto" w:line="259" w:before="0" w:after="160"/>
+        <w:ind w:hanging="0"/>
+        <w:jc w:val="left"/>
+        <w:rPr/>
+      </w:pPr>
+      <w:r>
+        <w:rPr/>
+      </w:r>
+    </w:p>
+    <w:p>
+      <w:pPr>
+        <w:pStyle w:val="Normal"/>
+        <w:spacing w:lineRule="auto" w:line="259" w:before="0" w:after="160"/>
+        <w:ind w:hanging="0"/>
+        <w:jc w:val="left"/>
+        <w:rPr/>
+      </w:pPr>
+      <w:r>
+        <w:rPr/>
+      </w:r>
+    </w:p>
+    <w:p>
+      <w:pPr>
+        <w:pStyle w:val="Normal"/>
+        <w:spacing w:lineRule="auto" w:line="259" w:before="0" w:after="160"/>
+        <w:ind w:hanging="0"/>
+        <w:jc w:val="left"/>
+        <w:rPr/>
+      </w:pPr>
+      <w:r>
+        <w:rPr/>
+      </w:r>
+    </w:p>
+    <w:p>
+      <w:pPr>
+        <w:pStyle w:val="Normal"/>
+        <w:spacing w:lineRule="auto" w:line="259" w:before="0" w:after="160"/>
+        <w:ind w:hanging="0"/>
+        <w:jc w:val="left"/>
+        <w:rPr/>
+      </w:pPr>
+      <w:r>
+        <w:rPr/>
+      </w:r>
+    </w:p>
+    <w:p>
+      <w:pPr>
+        <w:pStyle w:val="Normal"/>
+        <w:spacing w:lineRule="auto" w:line="259" w:before="0" w:after="160"/>
+        <w:ind w:hanging="0"/>
+        <w:jc w:val="left"/>
+        <w:rPr/>
+      </w:pPr>
+      <w:r>
+        <w:rPr/>
+      </w:r>
+    </w:p>
+    <w:p>
+      <w:pPr>
+        <w:pStyle w:val="Normal"/>
+        <w:spacing w:lineRule="auto" w:line="259" w:before="0" w:after="160"/>
+        <w:ind w:hanging="0"/>
+        <w:jc w:val="left"/>
+        <w:rPr/>
+      </w:pPr>
+      <w:r>
+        <w:rPr/>
+      </w:r>
+    </w:p>
+    <w:p>
+      <w:pPr>
+        <w:pStyle w:val="Normal"/>
+        <w:spacing w:lineRule="auto" w:line="259" w:before="0" w:after="160"/>
+        <w:ind w:hanging="0"/>
+        <w:jc w:val="left"/>
+        <w:rPr/>
+      </w:pPr>
+      <w:r>
+        <w:rPr/>
+      </w:r>
+    </w:p>
+    <w:p>
+      <w:pPr>
+        <w:pStyle w:val="Normal"/>
+        <w:spacing w:lineRule="auto" w:line="259" w:before="0" w:after="160"/>
+        <w:ind w:hanging="0"/>
+        <w:jc w:val="left"/>
+        <w:rPr/>
+      </w:pPr>
+      <w:r>
+        <w:rPr/>
+      </w:r>
+    </w:p>
+    <w:p>
+      <w:pPr>
+        <w:pStyle w:val="Normal"/>
+        <w:spacing w:lineRule="auto" w:line="259" w:before="0" w:after="160"/>
+        <w:ind w:hanging="0"/>
+        <w:jc w:val="left"/>
+        <w:rPr/>
+      </w:pPr>
+      <w:r>
+        <w:rPr/>
+      </w:r>
+    </w:p>
+    <w:p>
+      <w:pPr>
+        <w:pStyle w:val="Normal"/>
+        <w:spacing w:lineRule="auto" w:line="259" w:before="0" w:after="160"/>
+        <w:ind w:hanging="0"/>
+        <w:jc w:val="left"/>
+        <w:rPr/>
+      </w:pPr>
+      <w:r>
+        <w:rPr/>
+      </w:r>
+    </w:p>
+    <w:p>
+      <w:pPr>
+        <w:pStyle w:val="Normal"/>
+        <w:spacing w:lineRule="auto" w:line="259" w:before="0" w:after="160"/>
+        <w:ind w:hanging="0"/>
+        <w:jc w:val="left"/>
+        <w:rPr/>
+      </w:pPr>
+      <w:r>
+        <w:rPr/>
+      </w:r>
+    </w:p>
+    <w:p>
+      <w:pPr>
+        <w:pStyle w:val="Normal"/>
+        <w:spacing w:lineRule="auto" w:line="259" w:before="0" w:after="160"/>
+        <w:ind w:hanging="0"/>
+        <w:jc w:val="left"/>
+        <w:rPr/>
+      </w:pPr>
+      <w:r>
+        <w:rPr/>
+      </w:r>
+    </w:p>
+    <w:p>
+      <w:pPr>
+        <w:pStyle w:val="Normal"/>
+        <w:spacing w:lineRule="auto" w:line="259" w:before="0" w:after="160"/>
+        <w:ind w:hanging="0"/>
+        <w:jc w:val="left"/>
+        <w:rPr/>
+      </w:pPr>
+      <w:r>
+        <w:rPr/>
+      </w:r>
+    </w:p>
+    <w:p>
+      <w:pPr>
+        <w:pStyle w:val="Normal"/>
+        <w:spacing w:lineRule="auto" w:line="259" w:before="0" w:after="160"/>
+        <w:ind w:hanging="0"/>
+        <w:jc w:val="left"/>
+        <w:rPr/>
+      </w:pPr>
+      <w:r>
+        <w:rPr/>
+      </w:r>
+    </w:p>
+    <w:p>
+      <w:pPr>
+        <w:pStyle w:val="Normal"/>
+        <w:spacing w:lineRule="auto" w:line="259" w:before="0" w:after="160"/>
+        <w:ind w:hanging="0"/>
+        <w:jc w:val="left"/>
+        <w:rPr/>
+      </w:pPr>
+      <w:r>
+        <w:rPr/>
+      </w:r>
+    </w:p>
+    <w:p>
+      <w:pPr>
+        <w:pStyle w:val="Normal"/>
+        <w:spacing w:lineRule="auto" w:line="259" w:before="0" w:after="160"/>
+        <w:ind w:hanging="0"/>
+        <w:jc w:val="left"/>
+        <w:rPr/>
+      </w:pPr>
+      <w:r>
+        <w:rPr/>
+      </w:r>
+    </w:p>
+    <w:p>
+      <w:pPr>
+        <w:pStyle w:val="Normal"/>
+        <w:spacing w:lineRule="auto" w:line="259" w:before="0" w:after="160"/>
+        <w:ind w:hanging="0"/>
+        <w:jc w:val="left"/>
+        <w:rPr/>
+      </w:pPr>
+      <w:r>
+        <w:rPr/>
+      </w:r>
+      <w:r>
+        <w:br w:type="page"/>
+      </w:r>
+    </w:p>
+    <w:p>
+      <w:pPr>
+        <w:pStyle w:val="Heading1"/>
+        <w:numPr>
+          <w:ilvl w:val="0"/>
+          <w:numId w:val="2"/>
+        </w:numPr>
+        <w:spacing w:lineRule="auto" w:line="259" w:before="480" w:after="280"/>
+        <w:ind w:hanging="0"/>
+        <w:jc w:val="left"/>
+        <w:rPr/>
+      </w:pPr>
+      <w:r>
+        <w:rPr/>
+        <w:t>m</w:t>
+      </w:r>
+      <w:r>
+        <w:rPr/>
+        <w:t>TLS protokol</w:t>
+      </w:r>
+    </w:p>
+    <w:p>
+      <w:pPr>
+        <w:pStyle w:val="Heading2"/>
+        <w:numPr>
+          <w:ilvl w:val="1"/>
+          <w:numId w:val="2"/>
+        </w:numPr>
+        <w:spacing w:lineRule="auto" w:line="259" w:before="0" w:after="160"/>
+        <w:ind w:hanging="0"/>
+        <w:jc w:val="left"/>
+        <w:rPr/>
+      </w:pPr>
+      <w:r>
+        <w:rPr/>
+        <w:t>Š</w:t>
+      </w:r>
+      <w:r>
+        <w:rPr/>
+        <w:t>to je TLS</w:t>
+      </w:r>
+    </w:p>
+    <w:p>
+      <w:pPr>
+        <w:pStyle w:val="Heading2"/>
+        <w:numPr>
+          <w:ilvl w:val="1"/>
+          <w:numId w:val="2"/>
+        </w:numPr>
+        <w:spacing w:lineRule="auto" w:line="259" w:before="0" w:after="160"/>
+        <w:ind w:hanging="0"/>
+        <w:jc w:val="left"/>
+        <w:rPr/>
+      </w:pPr>
+      <w:r>
+        <w:rPr/>
+        <w:t>TLS vs mTLS</w:t>
+      </w:r>
+    </w:p>
+    <w:p>
+      <w:pPr>
+        <w:pStyle w:val="Heading2"/>
+        <w:numPr>
+          <w:ilvl w:val="1"/>
+          <w:numId w:val="2"/>
+        </w:numPr>
+        <w:spacing w:lineRule="auto" w:line="259" w:before="0" w:after="160"/>
+        <w:ind w:hanging="0"/>
+        <w:jc w:val="left"/>
+        <w:rPr/>
+      </w:pPr>
+      <w:r>
+        <w:rPr/>
+        <w:t xml:space="preserve">TLS </w:t>
+      </w:r>
+      <w:r>
+        <w:rPr/>
+        <w:t>handshake</w:t>
+      </w:r>
+    </w:p>
+    <w:p>
+      <w:pPr>
+        <w:pStyle w:val="Heading2"/>
+        <w:numPr>
+          <w:ilvl w:val="1"/>
+          <w:numId w:val="2"/>
+        </w:numPr>
+        <w:spacing w:lineRule="auto" w:line="259" w:before="0" w:after="160"/>
+        <w:ind w:hanging="0"/>
+        <w:jc w:val="left"/>
+        <w:rPr/>
+      </w:pPr>
+      <w:r>
+        <w:rPr/>
+        <w:t>Certifikati</w:t>
+      </w:r>
+      <w:r>
+        <w:br w:type="page"/>
+      </w:r>
+    </w:p>
+    <w:p>
+      <w:pPr>
+        <w:pStyle w:val="Heading1"/>
+        <w:numPr>
+          <w:ilvl w:val="0"/>
+          <w:numId w:val="2"/>
+        </w:numPr>
+        <w:spacing w:lineRule="auto" w:line="259" w:before="480" w:after="280"/>
+        <w:ind w:hanging="0"/>
+        <w:jc w:val="left"/>
+        <w:rPr/>
+      </w:pPr>
+      <w:r>
+        <w:rPr/>
+        <w:t>PKI infrastruktura</w:t>
+      </w:r>
+    </w:p>
+    <w:p>
+      <w:pPr>
+        <w:pStyle w:val="Heading2"/>
+        <w:numPr>
+          <w:ilvl w:val="1"/>
+          <w:numId w:val="2"/>
+        </w:numPr>
+        <w:spacing w:lineRule="auto" w:line="259" w:before="0" w:after="160"/>
+        <w:ind w:hanging="0"/>
+        <w:jc w:val="left"/>
+        <w:rPr/>
+      </w:pPr>
+      <w:r>
+        <w:rPr/>
+        <w:t>Š</w:t>
+      </w:r>
+      <w:r>
+        <w:rPr/>
+        <w:t xml:space="preserve">to je </w:t>
+      </w:r>
+      <w:r>
+        <w:rPr/>
+        <w:t>PKI</w:t>
+      </w:r>
+    </w:p>
+    <w:p>
+      <w:pPr>
+        <w:pStyle w:val="Heading2"/>
+        <w:numPr>
+          <w:ilvl w:val="1"/>
+          <w:numId w:val="2"/>
+        </w:numPr>
+        <w:spacing w:lineRule="auto" w:line="259" w:before="0" w:after="160"/>
+        <w:ind w:hanging="0"/>
+        <w:jc w:val="left"/>
+        <w:rPr/>
+      </w:pPr>
+      <w:r>
+        <w:rPr/>
+        <w:t>Certificate Authority</w:t>
+      </w:r>
+    </w:p>
+    <w:p>
+      <w:pPr>
+        <w:pStyle w:val="Heading2"/>
+        <w:numPr>
+          <w:ilvl w:val="1"/>
+          <w:numId w:val="2"/>
+        </w:numPr>
+        <w:spacing w:lineRule="auto" w:line="259" w:before="0" w:after="160"/>
+        <w:ind w:hanging="0"/>
+        <w:jc w:val="left"/>
+        <w:rPr/>
+      </w:pPr>
+      <w:r>
+        <w:rPr/>
+        <w:t>Izdavanje i rotacija certifikata</w:t>
+      </w:r>
+    </w:p>
+    <w:p>
+      <w:pPr>
+        <w:pStyle w:val="Heading2"/>
+        <w:numPr>
+          <w:ilvl w:val="1"/>
+          <w:numId w:val="2"/>
+        </w:numPr>
+        <w:spacing w:lineRule="auto" w:line="259" w:before="0" w:after="160"/>
+        <w:ind w:hanging="0"/>
+        <w:jc w:val="left"/>
+        <w:rPr/>
+      </w:pPr>
+      <w:r>
+        <w:rPr/>
+        <w:t xml:space="preserve">PKI u Kubernetesu </w:t>
+      </w:r>
+    </w:p>
+    <w:p>
+      <w:pPr>
+        <w:pStyle w:val="Heading2"/>
+        <w:numPr>
+          <w:ilvl w:val="1"/>
+          <w:numId w:val="2"/>
+        </w:numPr>
+        <w:spacing w:lineRule="auto" w:line="259" w:before="0" w:after="160"/>
+        <w:ind w:hanging="0"/>
+        <w:jc w:val="left"/>
+        <w:rPr/>
+      </w:pPr>
+      <w:r>
+        <w:rPr/>
+        <w:t>K</w:t>
+      </w:r>
+      <w:r>
+        <w:rPr/>
+        <w:t xml:space="preserve">ako </w:t>
+      </w:r>
+      <w:r>
+        <w:rPr/>
+        <w:t>s</w:t>
+      </w:r>
+      <w:r>
+        <w:rPr/>
+        <w:t>ervic</w:t>
+      </w:r>
+      <w:r>
+        <w:rPr/>
+        <w:t>e</w:t>
+      </w:r>
+      <w:r>
+        <w:rPr/>
+        <w:t xml:space="preserve"> mesh koristi PKI</w:t>
+      </w:r>
+    </w:p>
+    <w:p>
+      <w:pPr>
+        <w:pStyle w:val="Normal"/>
+        <w:spacing w:lineRule="auto" w:line="259" w:before="0" w:after="160"/>
+        <w:ind w:hanging="0"/>
+        <w:jc w:val="left"/>
+        <w:rPr/>
+      </w:pPr>
+      <w:r>
+        <w:rPr/>
+      </w:r>
+    </w:p>
+    <w:p>
+      <w:pPr>
+        <w:pStyle w:val="Normal"/>
+        <w:spacing w:lineRule="auto" w:line="259" w:before="0" w:after="160"/>
+        <w:ind w:hanging="0"/>
+        <w:jc w:val="left"/>
+        <w:rPr/>
+      </w:pPr>
+      <w:r>
+        <w:rPr/>
+      </w:r>
+    </w:p>
+    <w:p>
+      <w:pPr>
+        <w:pStyle w:val="Normal"/>
+        <w:spacing w:lineRule="auto" w:line="259" w:before="0" w:after="160"/>
+        <w:ind w:hanging="0"/>
+        <w:jc w:val="left"/>
+        <w:rPr/>
+      </w:pPr>
+      <w:r>
+        <w:rPr/>
+      </w:r>
+    </w:p>
+    <w:p>
+      <w:pPr>
+        <w:pStyle w:val="Normal"/>
+        <w:spacing w:lineRule="auto" w:line="259" w:before="0" w:after="160"/>
+        <w:ind w:hanging="0"/>
+        <w:jc w:val="left"/>
+        <w:rPr/>
+      </w:pPr>
+      <w:r>
+        <w:rPr/>
+      </w:r>
+    </w:p>
+    <w:p>
+      <w:pPr>
+        <w:pStyle w:val="Normal"/>
+        <w:spacing w:lineRule="auto" w:line="259" w:before="0" w:after="160"/>
+        <w:ind w:hanging="0"/>
+        <w:jc w:val="left"/>
+        <w:rPr/>
+      </w:pPr>
+      <w:r>
+        <w:rPr/>
+      </w:r>
+    </w:p>
+    <w:p>
+      <w:pPr>
+        <w:pStyle w:val="Normal"/>
+        <w:spacing w:lineRule="auto" w:line="259" w:before="0" w:after="160"/>
+        <w:ind w:hanging="0"/>
+        <w:jc w:val="left"/>
+        <w:rPr/>
+      </w:pPr>
+      <w:r>
+        <w:rPr/>
+      </w:r>
+    </w:p>
+    <w:p>
+      <w:pPr>
+        <w:pStyle w:val="Normal"/>
+        <w:spacing w:lineRule="auto" w:line="259" w:before="0" w:after="160"/>
+        <w:ind w:hanging="0"/>
+        <w:jc w:val="left"/>
+        <w:rPr/>
+      </w:pPr>
+      <w:r>
+        <w:rPr/>
+      </w:r>
+    </w:p>
+    <w:p>
+      <w:pPr>
+        <w:pStyle w:val="Normal"/>
+        <w:spacing w:lineRule="auto" w:line="259" w:before="0" w:after="160"/>
+        <w:ind w:hanging="0"/>
+        <w:jc w:val="left"/>
+        <w:rPr/>
+      </w:pPr>
+      <w:r>
+        <w:rPr/>
+      </w:r>
+    </w:p>
+    <w:p>
+      <w:pPr>
+        <w:pStyle w:val="Normal"/>
+        <w:spacing w:lineRule="auto" w:line="259" w:before="0" w:after="160"/>
+        <w:ind w:hanging="0"/>
+        <w:jc w:val="left"/>
+        <w:rPr/>
+      </w:pPr>
+      <w:r>
+        <w:rPr/>
+      </w:r>
+    </w:p>
+    <w:p>
+      <w:pPr>
+        <w:pStyle w:val="Normal"/>
+        <w:spacing w:lineRule="auto" w:line="259" w:before="0" w:after="160"/>
+        <w:ind w:hanging="0"/>
+        <w:jc w:val="left"/>
+        <w:rPr/>
+      </w:pPr>
+      <w:r>
+        <w:rPr/>
+      </w:r>
+    </w:p>
+    <w:p>
+      <w:pPr>
+        <w:pStyle w:val="Normal"/>
+        <w:spacing w:lineRule="auto" w:line="259" w:before="0" w:after="160"/>
+        <w:ind w:hanging="0"/>
+        <w:jc w:val="left"/>
+        <w:rPr/>
+      </w:pPr>
+      <w:r>
+        <w:rPr/>
+      </w:r>
+    </w:p>
+    <w:p>
+      <w:pPr>
+        <w:pStyle w:val="Normal"/>
+        <w:spacing w:lineRule="auto" w:line="259" w:before="0" w:after="160"/>
+        <w:ind w:hanging="0"/>
+        <w:jc w:val="left"/>
+        <w:rPr/>
+      </w:pPr>
+      <w:r>
+        <w:rPr/>
+      </w:r>
+    </w:p>
+    <w:p>
+      <w:pPr>
+        <w:pStyle w:val="Normal"/>
+        <w:spacing w:lineRule="auto" w:line="259" w:before="0" w:after="160"/>
+        <w:ind w:hanging="0"/>
+        <w:jc w:val="left"/>
+        <w:rPr/>
+      </w:pPr>
+      <w:r>
+        <w:rPr/>
+      </w:r>
+    </w:p>
+    <w:p>
+      <w:pPr>
+        <w:pStyle w:val="Normal"/>
+        <w:spacing w:lineRule="auto" w:line="259" w:before="0" w:after="160"/>
+        <w:ind w:hanging="0"/>
+        <w:jc w:val="left"/>
+        <w:rPr/>
+      </w:pPr>
+      <w:r>
+        <w:rPr/>
+      </w:r>
+    </w:p>
+    <w:p>
+      <w:pPr>
+        <w:pStyle w:val="Normal"/>
+        <w:spacing w:lineRule="auto" w:line="259" w:before="0" w:after="160"/>
+        <w:ind w:hanging="0"/>
+        <w:jc w:val="left"/>
+        <w:rPr/>
+      </w:pPr>
+      <w:r>
+        <w:rPr/>
+      </w:r>
+    </w:p>
+    <w:p>
+      <w:pPr>
+        <w:pStyle w:val="Normal"/>
+        <w:spacing w:lineRule="auto" w:line="259" w:before="0" w:after="160"/>
+        <w:ind w:hanging="0"/>
+        <w:jc w:val="left"/>
+        <w:rPr/>
+      </w:pPr>
+      <w:r>
+        <w:rPr/>
+      </w:r>
+    </w:p>
+    <w:p>
+      <w:pPr>
+        <w:pStyle w:val="Normal"/>
+        <w:spacing w:lineRule="auto" w:line="259" w:before="0" w:after="160"/>
+        <w:ind w:hanging="0"/>
+        <w:jc w:val="left"/>
+        <w:rPr/>
+      </w:pPr>
+      <w:r>
+        <w:rPr/>
+      </w:r>
+    </w:p>
+    <w:p>
+      <w:pPr>
+        <w:pStyle w:val="Normal"/>
+        <w:spacing w:lineRule="auto" w:line="259" w:before="0" w:after="160"/>
+        <w:ind w:hanging="0"/>
+        <w:jc w:val="left"/>
+        <w:rPr/>
+      </w:pPr>
+      <w:r>
+        <w:rPr/>
+      </w:r>
+    </w:p>
+    <w:p>
+      <w:pPr>
+        <w:pStyle w:val="Normal"/>
+        <w:spacing w:lineRule="auto" w:line="259" w:before="0" w:after="160"/>
+        <w:ind w:hanging="0"/>
+        <w:jc w:val="left"/>
+        <w:rPr/>
+      </w:pPr>
+      <w:r>
+        <w:rPr/>
+      </w:r>
+    </w:p>
+    <w:p>
+      <w:pPr>
+        <w:pStyle w:val="Normal"/>
+        <w:spacing w:lineRule="auto" w:line="259" w:before="0" w:after="160"/>
+        <w:ind w:hanging="0"/>
+        <w:jc w:val="left"/>
+        <w:rPr/>
+      </w:pPr>
+      <w:r>
+        <w:rPr/>
+      </w:r>
+    </w:p>
+    <w:p>
+      <w:pPr>
+        <w:pStyle w:val="Normal"/>
+        <w:spacing w:lineRule="auto" w:line="259" w:before="0" w:after="160"/>
+        <w:ind w:hanging="0"/>
+        <w:jc w:val="left"/>
+        <w:rPr/>
+      </w:pPr>
+      <w:r>
+        <w:rPr/>
+      </w:r>
+    </w:p>
+    <w:p>
+      <w:pPr>
+        <w:pStyle w:val="Normal"/>
+        <w:spacing w:lineRule="auto" w:line="259" w:before="0" w:after="160"/>
+        <w:ind w:hanging="0"/>
+        <w:jc w:val="left"/>
+        <w:rPr/>
+      </w:pPr>
+      <w:r>
+        <w:rPr/>
+      </w:r>
+      <w:r>
+        <w:br w:type="page"/>
+      </w:r>
+    </w:p>
+    <w:p>
+      <w:pPr>
+        <w:pStyle w:val="Heading1"/>
+        <w:numPr>
+          <w:ilvl w:val="0"/>
+          <w:numId w:val="2"/>
+        </w:numPr>
+        <w:spacing w:lineRule="auto" w:line="259" w:before="480" w:after="280"/>
+        <w:ind w:hanging="0"/>
+        <w:jc w:val="left"/>
+        <w:rPr/>
+      </w:pPr>
+      <w:r>
+        <w:rPr/>
+        <w:t>Service mesh</w:t>
+      </w:r>
+    </w:p>
+    <w:p>
+      <w:pPr>
+        <w:pStyle w:val="Heading2"/>
+        <w:numPr>
+          <w:ilvl w:val="1"/>
+          <w:numId w:val="2"/>
+        </w:numPr>
+        <w:spacing w:lineRule="auto" w:line="259" w:before="0" w:after="160"/>
+        <w:ind w:hanging="0"/>
+        <w:jc w:val="left"/>
+        <w:rPr/>
+      </w:pPr>
+      <w:r>
+        <w:rPr/>
+        <w:t>Š</w:t>
+      </w:r>
+      <w:r>
+        <w:rPr/>
+        <w:t xml:space="preserve">to je </w:t>
+      </w:r>
+      <w:r>
+        <w:rPr/>
+        <w:t>Service mesh</w:t>
+      </w:r>
+    </w:p>
+    <w:p>
+      <w:pPr>
+        <w:pStyle w:val="Heading2"/>
+        <w:numPr>
+          <w:ilvl w:val="1"/>
+          <w:numId w:val="2"/>
+        </w:numPr>
+        <w:spacing w:lineRule="auto" w:line="259" w:before="0" w:after="160"/>
+        <w:ind w:hanging="0"/>
+        <w:jc w:val="left"/>
+        <w:rPr/>
+      </w:pPr>
+      <w:r>
+        <w:rPr/>
+        <w:t>Sidecar proxy</w:t>
+      </w:r>
+    </w:p>
+    <w:p>
+      <w:pPr>
+        <w:pStyle w:val="Heading2"/>
+        <w:numPr>
+          <w:ilvl w:val="1"/>
+          <w:numId w:val="2"/>
+        </w:numPr>
+        <w:spacing w:lineRule="auto" w:line="259" w:before="0" w:after="160"/>
+        <w:ind w:hanging="0"/>
+        <w:jc w:val="left"/>
+        <w:rPr/>
+      </w:pPr>
+      <w:r>
+        <w:rPr/>
+        <w:t>K</w:t>
+      </w:r>
+      <w:r>
+        <w:rPr/>
+        <w:t xml:space="preserve">ontrolna i </w:t>
+      </w:r>
+      <w:r>
+        <w:rPr/>
+        <w:t>p</w:t>
+      </w:r>
+      <w:r>
+        <w:rPr/>
+        <w:t xml:space="preserve">odatkovna </w:t>
+      </w:r>
+      <w:r>
+        <w:rPr/>
+        <w:t>r</w:t>
+      </w:r>
+      <w:r>
+        <w:rPr/>
+        <w:t>avnina</w:t>
+      </w:r>
+    </w:p>
+    <w:p>
+      <w:pPr>
+        <w:pStyle w:val="Heading2"/>
+        <w:numPr>
+          <w:ilvl w:val="1"/>
+          <w:numId w:val="2"/>
+        </w:numPr>
+        <w:spacing w:lineRule="auto" w:line="259" w:before="0" w:after="160"/>
+        <w:ind w:hanging="0"/>
+        <w:jc w:val="left"/>
+        <w:rPr/>
+      </w:pPr>
+      <w:r>
+        <w:rPr/>
+        <w:t>Istio ili Linkerd</w:t>
+      </w:r>
+    </w:p>
+    <w:p>
+      <w:pPr>
+        <w:pStyle w:val="Normal"/>
+        <w:spacing w:lineRule="auto" w:line="259" w:before="0" w:after="160"/>
+        <w:ind w:hanging="0"/>
+        <w:jc w:val="left"/>
+        <w:rPr/>
+      </w:pPr>
+      <w:r>
+        <w:rPr/>
+      </w:r>
+    </w:p>
+    <w:p>
+      <w:pPr>
+        <w:pStyle w:val="Normal"/>
+        <w:spacing w:lineRule="auto" w:line="259" w:before="0" w:after="160"/>
+        <w:ind w:hanging="0"/>
+        <w:jc w:val="left"/>
+        <w:rPr/>
+      </w:pPr>
+      <w:r>
+        <w:rPr/>
+      </w:r>
+    </w:p>
+    <w:p>
+      <w:pPr>
+        <w:pStyle w:val="Normal"/>
+        <w:spacing w:lineRule="auto" w:line="259" w:before="0" w:after="160"/>
+        <w:ind w:hanging="0"/>
+        <w:jc w:val="left"/>
+        <w:rPr/>
+      </w:pPr>
+      <w:r>
+        <w:rPr/>
+      </w:r>
+    </w:p>
+    <w:p>
+      <w:pPr>
+        <w:pStyle w:val="Normal"/>
+        <w:spacing w:lineRule="auto" w:line="259" w:before="0" w:after="160"/>
+        <w:ind w:hanging="0"/>
+        <w:jc w:val="left"/>
+        <w:rPr/>
+      </w:pPr>
+      <w:r>
+        <w:rPr/>
+      </w:r>
+    </w:p>
+    <w:p>
+      <w:pPr>
+        <w:pStyle w:val="Normal"/>
+        <w:spacing w:lineRule="auto" w:line="259" w:before="0" w:after="160"/>
+        <w:ind w:hanging="0"/>
+        <w:jc w:val="left"/>
+        <w:rPr/>
+      </w:pPr>
+      <w:r>
+        <w:rPr/>
+      </w:r>
+    </w:p>
+    <w:p>
+      <w:pPr>
+        <w:pStyle w:val="Normal"/>
+        <w:spacing w:lineRule="auto" w:line="259" w:before="0" w:after="160"/>
+        <w:ind w:hanging="0"/>
+        <w:jc w:val="left"/>
+        <w:rPr/>
+      </w:pPr>
+      <w:r>
+        <w:rPr/>
+      </w:r>
+    </w:p>
+    <w:p>
+      <w:pPr>
+        <w:pStyle w:val="Normal"/>
+        <w:spacing w:lineRule="auto" w:line="259" w:before="0" w:after="160"/>
+        <w:ind w:hanging="0"/>
+        <w:jc w:val="left"/>
+        <w:rPr/>
+      </w:pPr>
+      <w:r>
+        <w:rPr/>
+      </w:r>
+    </w:p>
+    <w:p>
+      <w:pPr>
+        <w:pStyle w:val="Normal"/>
+        <w:spacing w:lineRule="auto" w:line="259" w:before="0" w:after="160"/>
+        <w:ind w:hanging="0"/>
+        <w:jc w:val="left"/>
+        <w:rPr/>
+      </w:pPr>
+      <w:r>
+        <w:rPr/>
+      </w:r>
+    </w:p>
+    <w:p>
+      <w:pPr>
+        <w:pStyle w:val="Normal"/>
+        <w:spacing w:lineRule="auto" w:line="259" w:before="0" w:after="160"/>
+        <w:ind w:hanging="0"/>
+        <w:jc w:val="left"/>
+        <w:rPr/>
+      </w:pPr>
+      <w:r>
+        <w:rPr/>
+      </w:r>
+    </w:p>
+    <w:p>
+      <w:pPr>
+        <w:pStyle w:val="Normal"/>
+        <w:spacing w:lineRule="auto" w:line="259" w:before="0" w:after="160"/>
+        <w:ind w:hanging="0"/>
+        <w:jc w:val="left"/>
+        <w:rPr/>
+      </w:pPr>
+      <w:r>
+        <w:rPr/>
+      </w:r>
+    </w:p>
+    <w:p>
+      <w:pPr>
+        <w:pStyle w:val="Normal"/>
+        <w:spacing w:lineRule="auto" w:line="259" w:before="0" w:after="160"/>
+        <w:ind w:hanging="0"/>
+        <w:jc w:val="left"/>
+        <w:rPr/>
+      </w:pPr>
+      <w:r>
+        <w:rPr/>
+      </w:r>
+    </w:p>
+    <w:p>
+      <w:pPr>
+        <w:pStyle w:val="Normal"/>
+        <w:spacing w:lineRule="auto" w:line="259" w:before="0" w:after="160"/>
+        <w:ind w:hanging="0"/>
+        <w:jc w:val="left"/>
+        <w:rPr/>
+      </w:pPr>
+      <w:r>
+        <w:rPr/>
+      </w:r>
+    </w:p>
+    <w:p>
+      <w:pPr>
+        <w:pStyle w:val="Normal"/>
+        <w:spacing w:lineRule="auto" w:line="259" w:before="0" w:after="160"/>
+        <w:ind w:hanging="0"/>
+        <w:jc w:val="left"/>
+        <w:rPr/>
+      </w:pPr>
+      <w:r>
+        <w:rPr/>
+      </w:r>
+    </w:p>
+    <w:p>
+      <w:pPr>
+        <w:pStyle w:val="Normal"/>
+        <w:spacing w:lineRule="auto" w:line="259" w:before="0" w:after="160"/>
+        <w:ind w:hanging="0"/>
+        <w:jc w:val="left"/>
+        <w:rPr/>
+      </w:pPr>
+      <w:r>
+        <w:rPr/>
+      </w:r>
+    </w:p>
+    <w:p>
+      <w:pPr>
+        <w:pStyle w:val="Normal"/>
+        <w:spacing w:lineRule="auto" w:line="259" w:before="0" w:after="160"/>
+        <w:ind w:hanging="0"/>
+        <w:jc w:val="left"/>
+        <w:rPr/>
+      </w:pPr>
+      <w:r>
+        <w:rPr/>
+      </w:r>
+    </w:p>
+    <w:p>
+      <w:pPr>
+        <w:pStyle w:val="Normal"/>
+        <w:spacing w:lineRule="auto" w:line="259" w:before="0" w:after="160"/>
+        <w:ind w:hanging="0"/>
+        <w:jc w:val="left"/>
+        <w:rPr/>
+      </w:pPr>
+      <w:r>
+        <w:rPr/>
+      </w:r>
+    </w:p>
+    <w:p>
+      <w:pPr>
+        <w:pStyle w:val="Normal"/>
+        <w:spacing w:lineRule="auto" w:line="259" w:before="0" w:after="160"/>
+        <w:ind w:hanging="0"/>
+        <w:jc w:val="left"/>
+        <w:rPr/>
+      </w:pPr>
+      <w:r>
+        <w:rPr/>
+      </w:r>
+    </w:p>
+    <w:p>
+      <w:pPr>
+        <w:pStyle w:val="Normal"/>
+        <w:spacing w:lineRule="auto" w:line="259" w:before="0" w:after="160"/>
+        <w:ind w:hanging="0"/>
+        <w:jc w:val="left"/>
+        <w:rPr/>
+      </w:pPr>
+      <w:r>
+        <w:rPr/>
+      </w:r>
+    </w:p>
+    <w:p>
+      <w:pPr>
+        <w:pStyle w:val="Normal"/>
+        <w:spacing w:lineRule="auto" w:line="259" w:before="0" w:after="160"/>
+        <w:ind w:hanging="0"/>
+        <w:jc w:val="left"/>
+        <w:rPr/>
+      </w:pPr>
+      <w:r>
+        <w:rPr/>
+      </w:r>
+    </w:p>
+    <w:p>
+      <w:pPr>
+        <w:pStyle w:val="Normal"/>
+        <w:spacing w:lineRule="auto" w:line="259" w:before="0" w:after="160"/>
+        <w:ind w:hanging="0"/>
+        <w:jc w:val="left"/>
+        <w:rPr/>
+      </w:pPr>
+      <w:r>
+        <w:rPr/>
+      </w:r>
+    </w:p>
+    <w:p>
+      <w:pPr>
+        <w:pStyle w:val="Normal"/>
+        <w:spacing w:lineRule="auto" w:line="259" w:before="0" w:after="160"/>
+        <w:ind w:hanging="0"/>
+        <w:jc w:val="left"/>
+        <w:rPr/>
+      </w:pPr>
+      <w:r>
+        <w:rPr/>
+      </w:r>
+    </w:p>
+    <w:p>
+      <w:pPr>
+        <w:pStyle w:val="Normal"/>
+        <w:spacing w:lineRule="auto" w:line="259" w:before="0" w:after="160"/>
+        <w:ind w:hanging="0"/>
+        <w:jc w:val="left"/>
+        <w:rPr/>
+      </w:pPr>
+      <w:r>
+        <w:rPr/>
+      </w:r>
+    </w:p>
+    <w:p>
+      <w:pPr>
+        <w:pStyle w:val="Normal"/>
+        <w:spacing w:lineRule="auto" w:line="259" w:before="0" w:after="160"/>
+        <w:ind w:hanging="0"/>
+        <w:jc w:val="left"/>
+        <w:rPr/>
+      </w:pPr>
+      <w:r>
+        <w:rPr/>
+      </w:r>
+      <w:r>
+        <w:br w:type="page"/>
+      </w:r>
+    </w:p>
+    <w:p>
+      <w:pPr>
+        <w:pStyle w:val="Heading1"/>
+        <w:numPr>
+          <w:ilvl w:val="0"/>
+          <w:numId w:val="2"/>
+        </w:numPr>
+        <w:spacing w:lineRule="auto" w:line="259" w:before="480" w:after="280"/>
+        <w:ind w:hanging="0"/>
+        <w:jc w:val="left"/>
+        <w:rPr/>
+      </w:pPr>
+      <w:r>
+        <w:rPr/>
+        <w:t>Implementacija</w:t>
       </w:r>
       <w:r>
         <w:br w:type="page"/>
@@ -4769,12 +6275,12 @@
         <w:spacing w:before="480" w:after="280"/>
         <w:rPr/>
       </w:pPr>
-      <w:bookmarkStart w:id="20" w:name="_Toc213706389"/>
+      <w:bookmarkStart w:id="16" w:name="_Toc213706389"/>
       <w:r>
         <w:rPr/>
         <w:t>Zaključak</w:t>
       </w:r>
-      <w:bookmarkEnd w:id="20"/>
+      <w:bookmarkEnd w:id="16"/>
     </w:p>
     <w:p>
       <w:pPr>
@@ -4842,12 +6348,12 @@
         <w:ind w:left="0" w:hanging="0"/>
         <w:rPr/>
       </w:pPr>
-      <w:bookmarkStart w:id="21" w:name="_Toc213706390"/>
+      <w:bookmarkStart w:id="17" w:name="_Toc213706390"/>
       <w:r>
         <w:rPr/>
         <w:t>Literatura</w:t>
       </w:r>
-      <w:bookmarkEnd w:id="21"/>
+      <w:bookmarkEnd w:id="17"/>
     </w:p>
     <w:p>
       <w:pPr>
@@ -4856,26 +6362,30 @@
           <w:ilvl w:val="0"/>
           <w:numId w:val="3"/>
         </w:numPr>
-        <w:spacing w:lineRule="auto" w:line="259" w:before="0" w:after="160"/>
+        <w:spacing w:lineRule="auto" w:line="276" w:before="0" w:after="160"/>
         <w:contextualSpacing/>
         <w:jc w:val="left"/>
         <w:rPr/>
       </w:pPr>
       <w:r>
         <w:rPr/>
-        <w:t>Prezime, Ime: „Naziv knjige“, izdavač, godina</w:t>
-      </w:r>
-    </w:p>
-    <w:p>
-      <w:pPr>
-        <w:pStyle w:val="Normal"/>
-        <w:spacing w:lineRule="auto" w:line="259" w:before="0" w:after="160"/>
-        <w:ind w:left="360" w:hanging="0"/>
-        <w:jc w:val="left"/>
-        <w:rPr/>
-      </w:pPr>
-      <w:r>
-        <w:rPr/>
+        <w:t xml:space="preserve">cybersecuritymagazine.com, </w:t>
+      </w:r>
+      <w:hyperlink r:id="rId10">
+        <w:r>
+          <w:rPr>
+            <w:rStyle w:val="InternetLink"/>
+          </w:rPr>
+          <w:t>https://cybersecurity-magazine.com/zero-trust-security-best-practices/</w:t>
+        </w:r>
+      </w:hyperlink>
+      <w:r>
+        <w:rPr/>
+        <w:t xml:space="preserve">, </w:t>
+      </w:r>
+      <w:r>
+        <w:rPr/>
+        <w:t>posjećeno 25.4.2026.</w:t>
       </w:r>
     </w:p>
     <w:p>
@@ -4885,55 +6395,190 @@
           <w:ilvl w:val="0"/>
           <w:numId w:val="3"/>
         </w:numPr>
-        <w:spacing w:lineRule="auto" w:line="259" w:before="0" w:after="160"/>
+        <w:spacing w:lineRule="auto" w:line="276" w:before="0" w:after="160"/>
         <w:contextualSpacing/>
         <w:jc w:val="left"/>
         <w:rPr/>
       </w:pPr>
-      <w:r>
-        <w:rPr/>
-        <w:t xml:space="preserve">Web stranica, </w:t>
-      </w:r>
-      <w:hyperlink r:id="rId8">
+      <w:hyperlink r:id="rId11">
         <w:r>
           <w:rPr>
-            <w:rStyle w:val="LinkoviChar"/>
+            <w:rStyle w:val="InternetLink"/>
           </w:rPr>
-          <w:t>https://link.do.stranice/staza</w:t>
+          <w:t>www.spiceworks.com</w:t>
         </w:r>
       </w:hyperlink>
       <w:r>
-        <w:rPr>
-          <w:rStyle w:val="LinkoviChar"/>
-        </w:rPr>
-        <w:t>,</w:t>
-      </w:r>
-      <w:r>
-        <w:rPr/>
-        <w:t xml:space="preserve"> posjećeno 1.1.2026.</w:t>
-      </w:r>
-    </w:p>
-    <w:p>
-      <w:pPr>
-        <w:pStyle w:val="Normal"/>
-        <w:spacing w:lineRule="auto" w:line="259" w:before="0" w:after="160"/>
-        <w:ind w:hanging="0"/>
-        <w:jc w:val="left"/>
-        <w:rPr>
-          <w:rFonts w:ascii="Arial" w:hAnsi="Arial" w:eastAsia="等线 Light" w:cs="Times New Roman" w:cstheme="majorBidi" w:eastAsiaTheme="majorEastAsia"/>
-          <w:b/>
-          <w:b/>
-          <w:sz w:val="36"/>
-          <w:szCs w:val="40"/>
-        </w:rPr>
-      </w:pPr>
-      <w:r>
-        <w:rPr>
-          <w:rFonts w:eastAsia="等线 Light" w:cs="Times New Roman" w:cstheme="majorBidi" w:eastAsiaTheme="majorEastAsia" w:ascii="Arial" w:hAnsi="Arial"/>
-          <w:b/>
-          <w:sz w:val="36"/>
-          <w:szCs w:val="40"/>
-        </w:rPr>
+        <w:rPr/>
+        <w:t xml:space="preserve">, </w:t>
+      </w:r>
+      <w:hyperlink r:id="rId12">
+        <w:r>
+          <w:rPr>
+            <w:rStyle w:val="InternetLink"/>
+          </w:rPr>
+          <w:t>https://www.spiceworks.com/software/what-is-cloud-computing/</w:t>
+        </w:r>
+      </w:hyperlink>
+      <w:r>
+        <w:rPr/>
+        <w:t>, posjećeno 26.4.2026.</w:t>
+      </w:r>
+    </w:p>
+    <w:p>
+      <w:pPr>
+        <w:pStyle w:val="ListParagraph"/>
+        <w:numPr>
+          <w:ilvl w:val="0"/>
+          <w:numId w:val="3"/>
+        </w:numPr>
+        <w:spacing w:lineRule="auto" w:line="276" w:before="0" w:after="160"/>
+        <w:contextualSpacing/>
+        <w:jc w:val="left"/>
+        <w:rPr/>
+      </w:pPr>
+      <w:hyperlink r:id="rId13">
+        <w:r>
+          <w:rPr>
+            <w:rStyle w:val="InternetLink"/>
+          </w:rPr>
+          <w:t>www.redhat.com</w:t>
+        </w:r>
+      </w:hyperlink>
+      <w:r>
+        <w:rPr/>
+        <w:t xml:space="preserve">, </w:t>
+      </w:r>
+      <w:hyperlink r:id="rId14">
+        <w:r>
+          <w:rPr>
+            <w:rStyle w:val="InternetLink"/>
+          </w:rPr>
+          <w:t>https://www.redhat.com/en/topics/microservices/what-are-microservices</w:t>
+        </w:r>
+      </w:hyperlink>
+      <w:r>
+        <w:rPr/>
+        <w:t xml:space="preserve">, </w:t>
+      </w:r>
+      <w:r>
+        <w:rPr/>
+        <w:t>posjećeno 26.4.2026.</w:t>
+      </w:r>
+    </w:p>
+    <w:p>
+      <w:pPr>
+        <w:pStyle w:val="ListParagraph"/>
+        <w:numPr>
+          <w:ilvl w:val="0"/>
+          <w:numId w:val="3"/>
+        </w:numPr>
+        <w:spacing w:lineRule="auto" w:line="276" w:before="0" w:after="160"/>
+        <w:contextualSpacing/>
+        <w:jc w:val="left"/>
+        <w:rPr/>
+      </w:pPr>
+      <w:hyperlink r:id="rId15">
+        <w:r>
+          <w:rPr>
+            <w:rStyle w:val="InternetLink"/>
+          </w:rPr>
+          <w:t>www.atlasian.com</w:t>
+        </w:r>
+      </w:hyperlink>
+      <w:r>
+        <w:rPr/>
+        <w:t xml:space="preserve">, </w:t>
+      </w:r>
+      <w:hyperlink r:id="rId16">
+        <w:r>
+          <w:rPr>
+            <w:rStyle w:val="InternetLink"/>
+          </w:rPr>
+          <w:t>https://www.atlassian.com/microservices/microservices-architecture/microservices-vs-monolith</w:t>
+        </w:r>
+      </w:hyperlink>
+      <w:r>
+        <w:rPr/>
+        <w:t xml:space="preserve">, </w:t>
+      </w:r>
+      <w:r>
+        <w:rPr/>
+        <w:t>posjećeno 24.6.2026.</w:t>
+      </w:r>
+    </w:p>
+    <w:p>
+      <w:pPr>
+        <w:pStyle w:val="ListParagraph"/>
+        <w:numPr>
+          <w:ilvl w:val="0"/>
+          <w:numId w:val="3"/>
+        </w:numPr>
+        <w:spacing w:lineRule="auto" w:line="276" w:before="0" w:after="160"/>
+        <w:contextualSpacing/>
+        <w:jc w:val="left"/>
+        <w:rPr/>
+      </w:pPr>
+      <w:r>
+        <w:rPr/>
+        <w:t xml:space="preserve">attack.mitre.com, </w:t>
+      </w:r>
+      <w:hyperlink r:id="rId17">
+        <w:r>
+          <w:rPr>
+            <w:rStyle w:val="InternetLink"/>
+          </w:rPr>
+          <w:t>https://attack.mitre.org/tactics/TA0008/</w:t>
+        </w:r>
+      </w:hyperlink>
+      <w:r>
+        <w:rPr/>
+        <w:t xml:space="preserve">, </w:t>
+      </w:r>
+      <w:r>
+        <w:rPr/>
+        <w:t>posjećeno 24.6.2026.</w:t>
+      </w:r>
+    </w:p>
+    <w:p>
+      <w:pPr>
+        <w:pStyle w:val="ListParagraph"/>
+        <w:numPr>
+          <w:ilvl w:val="0"/>
+          <w:numId w:val="3"/>
+        </w:numPr>
+        <w:spacing w:lineRule="auto" w:line="276" w:before="0" w:after="160"/>
+        <w:contextualSpacing/>
+        <w:jc w:val="left"/>
+        <w:rPr/>
+      </w:pPr>
+      <w:hyperlink r:id="rId18">
+        <w:r>
+          <w:rPr>
+            <w:rStyle w:val="InternetLink"/>
+          </w:rPr>
+          <w:t>www.crowdstrike.com</w:t>
+        </w:r>
+      </w:hyperlink>
+      <w:r>
+        <w:rPr/>
+        <w:t xml:space="preserve">, </w:t>
+      </w:r>
+      <w:hyperlink r:id="rId19">
+        <w:r>
+          <w:rPr>
+            <w:rStyle w:val="InternetLink"/>
+          </w:rPr>
+          <w:t>https://www.crowdstrike.com/en-us/cybersecurity-101/cyberattacks/lateral-movement/</w:t>
+        </w:r>
+      </w:hyperlink>
+      <w:r>
+        <w:rPr/>
+        <w:t xml:space="preserve">, </w:t>
+      </w:r>
+      <w:r>
+        <w:rPr/>
+        <w:t>posjećeno 24.6.2026.</w:t>
       </w:r>
       <w:r>
         <w:br w:type="page"/>
@@ -4950,12 +6595,12 @@
         <w:ind w:left="0" w:hanging="0"/>
         <w:rPr/>
       </w:pPr>
-      <w:bookmarkStart w:id="22" w:name="_Toc213706391"/>
+      <w:bookmarkStart w:id="18" w:name="_Toc213706391"/>
       <w:r>
         <w:rPr/>
         <w:t>Dodatak</w:t>
       </w:r>
-      <w:bookmarkEnd w:id="22"/>
+      <w:bookmarkEnd w:id="18"/>
     </w:p>
     <w:p>
       <w:pPr>
@@ -5170,8 +6815,8 @@
       </w:r>
     </w:p>
     <w:sectPr>
-      <w:headerReference w:type="default" r:id="rId9"/>
-      <w:footerReference w:type="default" r:id="rId10"/>
+      <w:headerReference w:type="default" r:id="rId20"/>
+      <w:footerReference w:type="default" r:id="rId21"/>
       <w:type w:val="nextPage"/>
       <w:pgSz w:w="11906" w:h="16838"/>
       <w:pgMar w:left="1701" w:right="1418" w:header="720" w:top="1418" w:footer="720" w:bottom="1701" w:gutter="0"/>
@@ -5192,7 +6837,7 @@
         <w:docPartGallery w:val="Page Numbers (Bottom of Page)"/>
         <w:docPartUnique w:val="true"/>
       </w:docPartObj>
-      <w:id w:val="1705587467"/>
+      <w:id w:val="1298758564"/>
     </w:sdtPr>
     <w:sdtContent>
       <w:p>
@@ -5227,7 +6872,7 @@
         <w:docPartGallery w:val="Page Numbers (Bottom of Page)"/>
         <w:docPartUnique w:val="true"/>
       </w:docPartObj>
-      <w:id w:val="1014112279"/>
+      <w:id w:val="1579733922"/>
     </w:sdtPr>
     <w:sdtContent>
       <w:p>
@@ -5250,7 +6895,7 @@
         </w:r>
         <w:r>
           <w:rPr/>
-          <w:t>19</w:t>
+          <w:t>23</w:t>
         </w:r>
         <w:r>
           <w:rPr/>
@@ -5360,6 +7005,7 @@
         </w:tabs>
         <w:ind w:left="907" w:hanging="907"/>
       </w:pPr>
+      <w:rPr/>
     </w:lvl>
     <w:lvl w:ilvl="3">
       <w:start w:val="1"/>
@@ -6073,6 +7719,7 @@
     <w:rsid w:val="00c81aba"/>
     <w:pPr>
       <w:widowControl/>
+      <w:suppressAutoHyphens w:val="true"/>
       <w:bidi w:val="0"/>
       <w:spacing w:lineRule="auto" w:line="360" w:before="240" w:after="0"/>
       <w:ind w:firstLine="567"/>
@@ -6743,6 +8390,19 @@
   </w:style>
   <w:style w:type="character" w:styleId="IndexLink">
     <w:name w:val="Index Link"/>
+    <w:qFormat/>
+    <w:rPr/>
+  </w:style>
+  <w:style w:type="character" w:styleId="StrongEmphasis">
+    <w:name w:val="Strong Emphasis"/>
+    <w:qFormat/>
+    <w:rPr>
+      <w:b/>
+      <w:bCs/>
+    </w:rPr>
+  </w:style>
+  <w:style w:type="character" w:styleId="NumberingSymbols">
+    <w:name w:val="Numbering Symbols"/>
     <w:qFormat/>
     <w:rPr/>
   </w:style>

</xml_diff>